<commit_message>
chore: stabilize Phase 1 deliverables
</commit_message>
<xml_diff>
--- a/vib_bot/project structure/project_structure.docx
+++ b/vib_bot/project structure/project_structure.docx
@@ -124,77 +124,135 @@
         <w:rPr>
           <w:lang w:val="en-US"/>
         </w:rPr>
-        <w:t>import subprocess</w:t>
-      </w:r>
-    </w:p>
-    <w:p>
-      <w:pPr>
-        <w:pStyle w:val="ListParagraph"/>
-        <w:rPr>
-          <w:lang w:val="en-US"/>
-        </w:rPr>
-      </w:pPr>
-      <w:r>
-        <w:rPr>
-          <w:lang w:val="en-US"/>
-        </w:rPr>
-        <w:t>import time</w:t>
-      </w:r>
-    </w:p>
-    <w:p>
-      <w:pPr>
-        <w:pStyle w:val="ListParagraph"/>
-        <w:rPr>
-          <w:lang w:val="en-US"/>
-        </w:rPr>
-      </w:pPr>
-      <w:r>
-        <w:rPr>
-          <w:lang w:val="en-US"/>
-        </w:rPr>
-        <w:t>import logging</w:t>
-      </w:r>
-    </w:p>
-    <w:p>
-      <w:pPr>
-        <w:pStyle w:val="ListParagraph"/>
-        <w:rPr>
-          <w:lang w:val="en-US"/>
-        </w:rPr>
-      </w:pPr>
-      <w:r>
-        <w:rPr>
-          <w:lang w:val="en-US"/>
-        </w:rPr>
-        <w:t>import os</w:t>
-      </w:r>
-    </w:p>
-    <w:p>
-      <w:pPr>
-        <w:pStyle w:val="ListParagraph"/>
-        <w:rPr>
-          <w:lang w:val="en-US"/>
-        </w:rPr>
-      </w:pPr>
-      <w:r>
-        <w:rPr>
-          <w:lang w:val="en-US"/>
-        </w:rPr>
-        <w:t>import signal</w:t>
-      </w:r>
-    </w:p>
-    <w:p>
-      <w:pPr>
-        <w:pStyle w:val="ListParagraph"/>
-        <w:rPr>
-          <w:lang w:val="en-US"/>
-        </w:rPr>
-      </w:pPr>
-      <w:r>
-        <w:rPr>
-          <w:lang w:val="en-US"/>
-        </w:rPr>
-        <w:t>import sys</w:t>
+        <w:t>"""</w:t>
+      </w:r>
+    </w:p>
+    <w:p>
+      <w:pPr>
+        <w:pStyle w:val="ListParagraph"/>
+        <w:rPr>
+          <w:lang w:val="en-US"/>
+        </w:rPr>
+      </w:pPr>
+      <w:r>
+        <w:rPr>
+          <w:lang w:val="en-US"/>
+        </w:rPr>
+        <w:t>scripts/master.py</w:t>
+      </w:r>
+    </w:p>
+    <w:p>
+      <w:pPr>
+        <w:pStyle w:val="ListParagraph"/>
+        <w:rPr>
+          <w:lang w:val="en-US"/>
+        </w:rPr>
+      </w:pPr>
+    </w:p>
+    <w:p>
+      <w:pPr>
+        <w:pStyle w:val="ListParagraph"/>
+        <w:rPr>
+          <w:lang w:val="en-US"/>
+        </w:rPr>
+      </w:pPr>
+      <w:r>
+        <w:rPr>
+          <w:lang w:val="en-US"/>
+        </w:rPr>
+        <w:t>1) symbols update (file)</w:t>
+      </w:r>
+    </w:p>
+    <w:p>
+      <w:pPr>
+        <w:pStyle w:val="ListParagraph"/>
+        <w:rPr>
+          <w:lang w:val="en-US"/>
+        </w:rPr>
+      </w:pPr>
+      <w:r>
+        <w:rPr>
+          <w:lang w:val="en-US"/>
+        </w:rPr>
+        <w:t>2) generate merged_training_data (module)</w:t>
+      </w:r>
+    </w:p>
+    <w:p>
+      <w:pPr>
+        <w:pStyle w:val="ListParagraph"/>
+        <w:rPr>
+          <w:lang w:val="en-US"/>
+        </w:rPr>
+      </w:pPr>
+      <w:r>
+        <w:rPr>
+          <w:lang w:val="en-US"/>
+        </w:rPr>
+        <w:t>3) offline trainers  (modules)</w:t>
+      </w:r>
+    </w:p>
+    <w:p>
+      <w:pPr>
+        <w:pStyle w:val="ListParagraph"/>
+        <w:rPr>
+          <w:lang w:val="en-US"/>
+        </w:rPr>
+      </w:pPr>
+      <w:r>
+        <w:rPr>
+          <w:lang w:val="en-US"/>
+        </w:rPr>
+        <w:t>4) model switch      (module)</w:t>
+      </w:r>
+    </w:p>
+    <w:p>
+      <w:pPr>
+        <w:pStyle w:val="ListParagraph"/>
+        <w:rPr>
+          <w:lang w:val="en-US"/>
+        </w:rPr>
+      </w:pPr>
+      <w:r>
+        <w:rPr>
+          <w:lang w:val="en-US"/>
+        </w:rPr>
+        <w:t>5) launch daemons    (mix of file + module)</w:t>
+      </w:r>
+    </w:p>
+    <w:p>
+      <w:pPr>
+        <w:pStyle w:val="ListParagraph"/>
+        <w:rPr>
+          <w:lang w:val="en-US"/>
+        </w:rPr>
+      </w:pPr>
+      <w:r>
+        <w:rPr>
+          <w:lang w:val="en-US"/>
+        </w:rPr>
+        <w:t>"""</w:t>
+      </w:r>
+    </w:p>
+    <w:p>
+      <w:pPr>
+        <w:pStyle w:val="ListParagraph"/>
+        <w:rPr>
+          <w:lang w:val="en-US"/>
+        </w:rPr>
+      </w:pPr>
+    </w:p>
+    <w:p>
+      <w:pPr>
+        <w:pStyle w:val="ListParagraph"/>
+        <w:rPr>
+          <w:lang w:val="en-US"/>
+        </w:rPr>
+      </w:pPr>
+      <w:r>
+        <w:rPr>
+          <w:lang w:val="en-US"/>
+        </w:rPr>
+        <w:t>import subprocess, time, logging, os, signal, sys</w:t>
       </w:r>
     </w:p>
     <w:p>
@@ -336,113 +394,135 @@
         <w:rPr>
           <w:lang w:val="en-US"/>
         </w:rPr>
-        <w:t># ─── Paths for your orchestration scripts ────────────────────────────────────</w:t>
-      </w:r>
-    </w:p>
-    <w:p>
-      <w:pPr>
-        <w:pStyle w:val="ListParagraph"/>
-        <w:rPr>
-          <w:lang w:val="en-US"/>
-        </w:rPr>
-      </w:pPr>
-      <w:r>
-        <w:rPr>
-          <w:lang w:val="en-US"/>
-        </w:rPr>
-        <w:t>UPDATE_SYMBOLS_SCRIPT = os.path.join(BASE_DIR, "scripts", "update_symbols.py")</w:t>
-      </w:r>
-    </w:p>
-    <w:p>
-      <w:pPr>
-        <w:pStyle w:val="ListParagraph"/>
-        <w:rPr>
-          <w:lang w:val="en-US"/>
-        </w:rPr>
-      </w:pPr>
-      <w:r>
-        <w:rPr>
-          <w:lang w:val="en-US"/>
-        </w:rPr>
-        <w:t>GENERATE_SCRIPT       = os.path.join(BASE_DIR, "processing", "generate_training_data.py")</w:t>
-      </w:r>
-    </w:p>
-    <w:p>
-      <w:pPr>
-        <w:pStyle w:val="ListParagraph"/>
-        <w:rPr>
-          <w:lang w:val="en-US"/>
-        </w:rPr>
-      </w:pPr>
-      <w:r>
-        <w:rPr>
-          <w:lang w:val="en-US"/>
-        </w:rPr>
-        <w:t>TRAINER_LINEAR        = os.path.join(BASE_DIR, "models", "train_model_linear.py")</w:t>
-      </w:r>
-    </w:p>
-    <w:p>
-      <w:pPr>
-        <w:pStyle w:val="ListParagraph"/>
-        <w:rPr>
-          <w:lang w:val="en-US"/>
-        </w:rPr>
-      </w:pPr>
-      <w:r>
-        <w:rPr>
-          <w:lang w:val="en-US"/>
-        </w:rPr>
-        <w:t>TRAINER_NN            = os.path.join(BASE_DIR, "models", "train_model_nn.py")</w:t>
-      </w:r>
-    </w:p>
-    <w:p>
-      <w:pPr>
-        <w:pStyle w:val="ListParagraph"/>
-        <w:rPr>
-          <w:lang w:val="en-US"/>
-        </w:rPr>
-      </w:pPr>
-      <w:r>
-        <w:rPr>
-          <w:lang w:val="en-US"/>
-        </w:rPr>
-        <w:t>EVAL_SWITCH_SCRIPT    = os.path.join(BASE_DIR, "models", "evaluate_and_switch.py")</w:t>
-      </w:r>
-    </w:p>
-    <w:p>
-      <w:pPr>
-        <w:pStyle w:val="ListParagraph"/>
-        <w:rPr>
-          <w:lang w:val="en-US"/>
-        </w:rPr>
-      </w:pPr>
-    </w:p>
-    <w:p>
-      <w:pPr>
-        <w:pStyle w:val="ListParagraph"/>
-        <w:rPr>
-          <w:lang w:val="en-US"/>
-        </w:rPr>
-      </w:pPr>
-      <w:r>
-        <w:rPr>
-          <w:lang w:val="en-US"/>
-        </w:rPr>
-        <w:t># ─── Logger Setup ────────────────────────────────────────────────────────────</w:t>
-      </w:r>
-    </w:p>
-    <w:p>
-      <w:pPr>
-        <w:pStyle w:val="ListParagraph"/>
-        <w:rPr>
-          <w:lang w:val="en-US"/>
-        </w:rPr>
-      </w:pPr>
-      <w:r>
-        <w:rPr>
-          <w:lang w:val="en-US"/>
-        </w:rPr>
-        <w:t>MASTER_LOG_FILE = os.path.join(BASE_DIR, "master.log")</w:t>
+        <w:t># ─── File scripts ────────────────────────────────────────────────────────────</w:t>
+      </w:r>
+    </w:p>
+    <w:p>
+      <w:pPr>
+        <w:pStyle w:val="ListParagraph"/>
+        <w:rPr>
+          <w:lang w:val="en-US"/>
+        </w:rPr>
+      </w:pPr>
+      <w:r>
+        <w:rPr>
+          <w:lang w:val="en-US"/>
+        </w:rPr>
+        <w:t>UPDATE_SYMBOLS = os.path.join(BASE_DIR, "scripts", "update_symbols.py")</w:t>
+      </w:r>
+    </w:p>
+    <w:p>
+      <w:pPr>
+        <w:pStyle w:val="ListParagraph"/>
+        <w:rPr>
+          <w:lang w:val="en-US"/>
+        </w:rPr>
+      </w:pPr>
+    </w:p>
+    <w:p>
+      <w:pPr>
+        <w:pStyle w:val="ListParagraph"/>
+        <w:rPr>
+          <w:lang w:val="en-US"/>
+        </w:rPr>
+      </w:pPr>
+      <w:r>
+        <w:rPr>
+          <w:lang w:val="en-US"/>
+        </w:rPr>
+        <w:t># ─── Module invocations ──────────────────────────────────────────────────────</w:t>
+      </w:r>
+    </w:p>
+    <w:p>
+      <w:pPr>
+        <w:pStyle w:val="ListParagraph"/>
+        <w:rPr>
+          <w:lang w:val="en-US"/>
+        </w:rPr>
+      </w:pPr>
+      <w:r>
+        <w:rPr>
+          <w:lang w:val="en-US"/>
+        </w:rPr>
+        <w:t>GENERATE_MODULE    = "vib_bot.processing.generate_training_data"</w:t>
+      </w:r>
+    </w:p>
+    <w:p>
+      <w:pPr>
+        <w:pStyle w:val="ListParagraph"/>
+        <w:rPr>
+          <w:lang w:val="en-US"/>
+        </w:rPr>
+      </w:pPr>
+      <w:r>
+        <w:rPr>
+          <w:lang w:val="en-US"/>
+        </w:rPr>
+        <w:t>LINEAR_MODULE      = "vib_bot.models.train_model_linear"</w:t>
+      </w:r>
+    </w:p>
+    <w:p>
+      <w:pPr>
+        <w:pStyle w:val="ListParagraph"/>
+        <w:rPr>
+          <w:lang w:val="en-US"/>
+        </w:rPr>
+      </w:pPr>
+      <w:r>
+        <w:rPr>
+          <w:lang w:val="en-US"/>
+        </w:rPr>
+        <w:t>NN_MODULE          = "vib_bot.models.train_model_nn"</w:t>
+      </w:r>
+    </w:p>
+    <w:p>
+      <w:pPr>
+        <w:pStyle w:val="ListParagraph"/>
+        <w:rPr>
+          <w:lang w:val="en-US"/>
+        </w:rPr>
+      </w:pPr>
+      <w:r>
+        <w:rPr>
+          <w:lang w:val="en-US"/>
+        </w:rPr>
+        <w:t>SWITCH_MODULE      = "vib_bot.models.evaluate_and_switch"</w:t>
+      </w:r>
+    </w:p>
+    <w:p>
+      <w:pPr>
+        <w:pStyle w:val="ListParagraph"/>
+        <w:rPr>
+          <w:lang w:val="en-US"/>
+        </w:rPr>
+      </w:pPr>
+    </w:p>
+    <w:p>
+      <w:pPr>
+        <w:pStyle w:val="ListParagraph"/>
+        <w:rPr>
+          <w:lang w:val="en-US"/>
+        </w:rPr>
+      </w:pPr>
+      <w:r>
+        <w:rPr>
+          <w:lang w:val="en-US"/>
+        </w:rPr>
+        <w:t># ─── Logging ─────────────────────────────────────────────────────────────────</w:t>
+      </w:r>
+    </w:p>
+    <w:p>
+      <w:pPr>
+        <w:pStyle w:val="ListParagraph"/>
+        <w:rPr>
+          <w:lang w:val="en-US"/>
+        </w:rPr>
+      </w:pPr>
+      <w:r>
+        <w:rPr>
+          <w:lang w:val="en-US"/>
+        </w:rPr>
+        <w:t>MASTER_LOG = os.path.join(BASE_DIR, "master.log")</w:t>
       </w:r>
     </w:p>
     <w:p>
@@ -484,129 +564,151 @@
         <w:rPr>
           <w:lang w:val="en-US"/>
         </w:rPr>
-        <w:t>fmt = logging.Formatter("%(asctime)s [%(levelname)s] %(message)s", datefmt="%Y-%m-%dT%H:%M:%SZ")</w:t>
-      </w:r>
-    </w:p>
-    <w:p>
-      <w:pPr>
-        <w:pStyle w:val="ListParagraph"/>
-        <w:rPr>
-          <w:lang w:val="en-US"/>
-        </w:rPr>
-      </w:pPr>
-    </w:p>
-    <w:p>
-      <w:pPr>
-        <w:pStyle w:val="ListParagraph"/>
-        <w:rPr>
-          <w:lang w:val="en-US"/>
-        </w:rPr>
-      </w:pPr>
-      <w:r>
-        <w:rPr>
-          <w:lang w:val="en-US"/>
-        </w:rPr>
-        <w:t>rot_handler = RotatingFileHandler(MASTER_LOG_FILE, maxBytes=5*1024*1024, backupCount=3)</w:t>
-      </w:r>
-    </w:p>
-    <w:p>
-      <w:pPr>
-        <w:pStyle w:val="ListParagraph"/>
-        <w:rPr>
-          <w:lang w:val="en-US"/>
-        </w:rPr>
-      </w:pPr>
-      <w:r>
-        <w:rPr>
-          <w:lang w:val="en-US"/>
-        </w:rPr>
-        <w:t>rot_handler.setFormatter(fmt)</w:t>
-      </w:r>
-    </w:p>
-    <w:p>
-      <w:pPr>
-        <w:pStyle w:val="ListParagraph"/>
-        <w:rPr>
-          <w:lang w:val="en-US"/>
-        </w:rPr>
-      </w:pPr>
-      <w:r>
-        <w:rPr>
-          <w:lang w:val="en-US"/>
-        </w:rPr>
-        <w:t>logger.addHandler(rot_handler)</w:t>
-      </w:r>
-    </w:p>
-    <w:p>
-      <w:pPr>
-        <w:pStyle w:val="ListParagraph"/>
-        <w:rPr>
-          <w:lang w:val="en-US"/>
-        </w:rPr>
-      </w:pPr>
-    </w:p>
-    <w:p>
-      <w:pPr>
-        <w:pStyle w:val="ListParagraph"/>
-        <w:rPr>
-          <w:lang w:val="en-US"/>
-        </w:rPr>
-      </w:pPr>
-      <w:r>
-        <w:rPr>
-          <w:lang w:val="en-US"/>
-        </w:rPr>
-        <w:t>stream_handler = logging.StreamHandler()</w:t>
-      </w:r>
-    </w:p>
-    <w:p>
-      <w:pPr>
-        <w:pStyle w:val="ListParagraph"/>
-        <w:rPr>
-          <w:lang w:val="en-US"/>
-        </w:rPr>
-      </w:pPr>
-      <w:r>
-        <w:rPr>
-          <w:lang w:val="en-US"/>
-        </w:rPr>
-        <w:t>stream_handler.setFormatter(fmt)</w:t>
-      </w:r>
-    </w:p>
-    <w:p>
-      <w:pPr>
-        <w:pStyle w:val="ListParagraph"/>
-        <w:rPr>
-          <w:lang w:val="en-US"/>
-        </w:rPr>
-      </w:pPr>
-      <w:r>
-        <w:rPr>
-          <w:lang w:val="en-US"/>
-        </w:rPr>
-        <w:t>logger.addHandler(stream_handler)</w:t>
-      </w:r>
-    </w:p>
-    <w:p>
-      <w:pPr>
-        <w:pStyle w:val="ListParagraph"/>
-        <w:rPr>
-          <w:lang w:val="en-US"/>
-        </w:rPr>
-      </w:pPr>
-    </w:p>
-    <w:p>
-      <w:pPr>
-        <w:pStyle w:val="ListParagraph"/>
-        <w:rPr>
-          <w:lang w:val="en-US"/>
-        </w:rPr>
-      </w:pPr>
-      <w:r>
-        <w:rPr>
-          <w:lang w:val="en-US"/>
-        </w:rPr>
-        <w:t>def run_script(path, description):</w:t>
+        <w:t>fmt = logging.Formatter("%(asctime)s [%(levelname)s] %(message)s",</w:t>
+      </w:r>
+    </w:p>
+    <w:p>
+      <w:pPr>
+        <w:pStyle w:val="ListParagraph"/>
+        <w:rPr>
+          <w:lang w:val="en-US"/>
+        </w:rPr>
+      </w:pPr>
+      <w:r>
+        <w:rPr>
+          <w:lang w:val="en-US"/>
+        </w:rPr>
+        <w:t xml:space="preserve">                        datefmt="%Y-%m-%dT%H:%M:%SZ")</w:t>
+      </w:r>
+    </w:p>
+    <w:p>
+      <w:pPr>
+        <w:pStyle w:val="ListParagraph"/>
+        <w:rPr>
+          <w:lang w:val="en-US"/>
+        </w:rPr>
+      </w:pPr>
+    </w:p>
+    <w:p>
+      <w:pPr>
+        <w:pStyle w:val="ListParagraph"/>
+        <w:rPr>
+          <w:lang w:val="en-US"/>
+        </w:rPr>
+      </w:pPr>
+      <w:r>
+        <w:rPr>
+          <w:lang w:val="en-US"/>
+        </w:rPr>
+        <w:t>rot = RotatingFileHandler(MASTER_LOG, maxBytes=5*1024*1024, backupCount=3)</w:t>
+      </w:r>
+    </w:p>
+    <w:p>
+      <w:pPr>
+        <w:pStyle w:val="ListParagraph"/>
+        <w:rPr>
+          <w:lang w:val="en-US"/>
+        </w:rPr>
+      </w:pPr>
+      <w:r>
+        <w:rPr>
+          <w:lang w:val="en-US"/>
+        </w:rPr>
+        <w:t>rot.setFormatter(fmt)</w:t>
+      </w:r>
+    </w:p>
+    <w:p>
+      <w:pPr>
+        <w:pStyle w:val="ListParagraph"/>
+        <w:rPr>
+          <w:lang w:val="en-US"/>
+        </w:rPr>
+      </w:pPr>
+      <w:r>
+        <w:rPr>
+          <w:lang w:val="en-US"/>
+        </w:rPr>
+        <w:t>logger.addHandler(rot)</w:t>
+      </w:r>
+    </w:p>
+    <w:p>
+      <w:pPr>
+        <w:pStyle w:val="ListParagraph"/>
+        <w:rPr>
+          <w:lang w:val="en-US"/>
+        </w:rPr>
+      </w:pPr>
+    </w:p>
+    <w:p>
+      <w:pPr>
+        <w:pStyle w:val="ListParagraph"/>
+        <w:rPr>
+          <w:lang w:val="en-US"/>
+        </w:rPr>
+      </w:pPr>
+      <w:r>
+        <w:rPr>
+          <w:lang w:val="en-US"/>
+        </w:rPr>
+        <w:t>stream = logging.StreamHandler()</w:t>
+      </w:r>
+    </w:p>
+    <w:p>
+      <w:pPr>
+        <w:pStyle w:val="ListParagraph"/>
+        <w:rPr>
+          <w:lang w:val="en-US"/>
+        </w:rPr>
+      </w:pPr>
+      <w:r>
+        <w:rPr>
+          <w:lang w:val="en-US"/>
+        </w:rPr>
+        <w:t>stream.setFormatter(fmt)</w:t>
+      </w:r>
+    </w:p>
+    <w:p>
+      <w:pPr>
+        <w:pStyle w:val="ListParagraph"/>
+        <w:rPr>
+          <w:lang w:val="en-US"/>
+        </w:rPr>
+      </w:pPr>
+      <w:r>
+        <w:rPr>
+          <w:lang w:val="en-US"/>
+        </w:rPr>
+        <w:t>logger.addHandler(stream)</w:t>
+      </w:r>
+    </w:p>
+    <w:p>
+      <w:pPr>
+        <w:pStyle w:val="ListParagraph"/>
+        <w:rPr>
+          <w:lang w:val="en-US"/>
+        </w:rPr>
+      </w:pPr>
+    </w:p>
+    <w:p>
+      <w:pPr>
+        <w:pStyle w:val="ListParagraph"/>
+        <w:rPr>
+          <w:lang w:val="en-US"/>
+        </w:rPr>
+      </w:pPr>
+    </w:p>
+    <w:p>
+      <w:pPr>
+        <w:pStyle w:val="ListParagraph"/>
+        <w:rPr>
+          <w:lang w:val="en-US"/>
+        </w:rPr>
+      </w:pPr>
+      <w:r>
+        <w:rPr>
+          <w:lang w:val="en-US"/>
+        </w:rPr>
+        <w:t>def run_script(path, desc):</w:t>
       </w:r>
     </w:p>
     <w:p>
@@ -633,7 +735,7 @@
         <w:rPr>
           <w:lang w:val="en-US"/>
         </w:rPr>
-        <w:t xml:space="preserve">  {description}…")</w:t>
+        <w:t xml:space="preserve">  {desc}…")</w:t>
       </w:r>
     </w:p>
     <w:p>
@@ -661,21 +763,21 @@
         <w:rPr>
           <w:lang w:val="en-US"/>
         </w:rPr>
-        <w:t xml:space="preserve">    if rc != 0:</w:t>
-      </w:r>
-    </w:p>
-    <w:p>
-      <w:pPr>
-        <w:pStyle w:val="ListParagraph"/>
-        <w:rPr>
-          <w:lang w:val="en-US"/>
-        </w:rPr>
-      </w:pPr>
-      <w:r>
-        <w:rPr>
-          <w:lang w:val="en-US"/>
-        </w:rPr>
-        <w:t xml:space="preserve">        logger.error(f"{description} failed (exit code {rc}); aborting master startup.")</w:t>
+        <w:t xml:space="preserve">    if rc:</w:t>
+      </w:r>
+    </w:p>
+    <w:p>
+      <w:pPr>
+        <w:pStyle w:val="ListParagraph"/>
+        <w:rPr>
+          <w:lang w:val="en-US"/>
+        </w:rPr>
+      </w:pPr>
+      <w:r>
+        <w:rPr>
+          <w:lang w:val="en-US"/>
+        </w:rPr>
+        <w:t xml:space="preserve">        logger.error(f"{desc} failed (exit {rc}); aborting.")</w:t>
       </w:r>
     </w:p>
     <w:p>
@@ -716,140 +818,249 @@
         <w:rPr>
           <w:lang w:val="en-US"/>
         </w:rPr>
-        <w:t xml:space="preserve">  {description} completed successfully.")</w:t>
-      </w:r>
-    </w:p>
-    <w:p>
-      <w:pPr>
-        <w:pStyle w:val="ListParagraph"/>
-        <w:rPr>
-          <w:lang w:val="en-US"/>
-        </w:rPr>
-      </w:pPr>
-    </w:p>
-    <w:p>
-      <w:pPr>
-        <w:pStyle w:val="ListParagraph"/>
-        <w:rPr>
-          <w:lang w:val="en-US"/>
-        </w:rPr>
-      </w:pPr>
-      <w:r>
-        <w:rPr>
-          <w:lang w:val="en-US"/>
-        </w:rPr>
-        <w:t># ─── Step</w:t>
-      </w:r>
-      <w:r>
-        <w:rPr>
-          <w:rFonts w:ascii="Arial" w:hAnsi="Arial" w:cs="Arial"/>
-          <w:lang w:val="en-US"/>
-        </w:rPr>
-        <w:t> </w:t>
-      </w:r>
-      <w:r>
-        <w:rPr>
-          <w:lang w:val="en-US"/>
-        </w:rPr>
-        <w:t>0: Update symbol list ───────────────────────────────────────────────</w:t>
-      </w:r>
-    </w:p>
-    <w:p>
-      <w:pPr>
-        <w:pStyle w:val="ListParagraph"/>
-        <w:rPr>
-          <w:lang w:val="en-US"/>
-        </w:rPr>
-      </w:pPr>
-      <w:r>
-        <w:rPr>
-          <w:lang w:val="en-US"/>
-        </w:rPr>
-        <w:t>run_script(UPDATE_SYMBOLS_SCRIPT, "Updating symbols.json")</w:t>
-      </w:r>
-    </w:p>
-    <w:p>
-      <w:pPr>
-        <w:pStyle w:val="ListParagraph"/>
-        <w:rPr>
-          <w:lang w:val="en-US"/>
-        </w:rPr>
-      </w:pPr>
-    </w:p>
-    <w:p>
-      <w:pPr>
-        <w:pStyle w:val="ListParagraph"/>
-        <w:rPr>
-          <w:lang w:val="en-US"/>
-        </w:rPr>
-      </w:pPr>
-      <w:r>
-        <w:rPr>
-          <w:lang w:val="en-US"/>
-        </w:rPr>
-        <w:t># ─── Step</w:t>
-      </w:r>
-      <w:r>
-        <w:rPr>
-          <w:rFonts w:ascii="Arial" w:hAnsi="Arial" w:cs="Arial"/>
-          <w:lang w:val="en-US"/>
-        </w:rPr>
-        <w:t> </w:t>
-      </w:r>
-      <w:r>
-        <w:rPr>
-          <w:lang w:val="en-US"/>
-        </w:rPr>
-        <w:t>1: Generate merged training data ───────────────────────────────────</w:t>
-      </w:r>
-    </w:p>
-    <w:p>
-      <w:pPr>
-        <w:pStyle w:val="ListParagraph"/>
-        <w:rPr>
-          <w:lang w:val="en-US"/>
-        </w:rPr>
-      </w:pPr>
-      <w:r>
-        <w:rPr>
-          <w:lang w:val="en-US"/>
-        </w:rPr>
-        <w:t>run_script(GENERATE_SCRIPT, "Generating merged_training_data")</w:t>
-      </w:r>
-    </w:p>
-    <w:p>
-      <w:pPr>
-        <w:pStyle w:val="ListParagraph"/>
-        <w:rPr>
-          <w:lang w:val="en-US"/>
-        </w:rPr>
-      </w:pPr>
-    </w:p>
-    <w:p>
-      <w:pPr>
-        <w:pStyle w:val="ListParagraph"/>
-        <w:rPr>
-          <w:lang w:val="en-US"/>
-        </w:rPr>
-      </w:pPr>
-      <w:r>
-        <w:rPr>
-          <w:lang w:val="en-US"/>
-        </w:rPr>
-        <w:t># ─── Step</w:t>
-      </w:r>
-      <w:r>
-        <w:rPr>
-          <w:rFonts w:ascii="Arial" w:hAnsi="Arial" w:cs="Arial"/>
-          <w:lang w:val="en-US"/>
-        </w:rPr>
-        <w:t> </w:t>
-      </w:r>
-      <w:r>
-        <w:rPr>
-          <w:lang w:val="en-US"/>
-        </w:rPr>
-        <w:t>2: Bootstrap linear model if missing ───────────────────────────────</w:t>
+        <w:t xml:space="preserve">  {desc} completed.")</w:t>
+      </w:r>
+    </w:p>
+    <w:p>
+      <w:pPr>
+        <w:pStyle w:val="ListParagraph"/>
+        <w:rPr>
+          <w:lang w:val="en-US"/>
+        </w:rPr>
+      </w:pPr>
+    </w:p>
+    <w:p>
+      <w:pPr>
+        <w:pStyle w:val="ListParagraph"/>
+        <w:rPr>
+          <w:lang w:val="en-US"/>
+        </w:rPr>
+      </w:pPr>
+    </w:p>
+    <w:p>
+      <w:pPr>
+        <w:pStyle w:val="ListParagraph"/>
+        <w:rPr>
+          <w:lang w:val="en-US"/>
+        </w:rPr>
+      </w:pPr>
+      <w:r>
+        <w:rPr>
+          <w:lang w:val="en-US"/>
+        </w:rPr>
+        <w:t>def run_module(module, desc):</w:t>
+      </w:r>
+    </w:p>
+    <w:p>
+      <w:pPr>
+        <w:pStyle w:val="ListParagraph"/>
+        <w:rPr>
+          <w:lang w:val="en-US"/>
+        </w:rPr>
+      </w:pPr>
+      <w:r>
+        <w:rPr>
+          <w:lang w:val="en-US"/>
+        </w:rPr>
+        <w:t xml:space="preserve">    logger.info(f"</w:t>
+      </w:r>
+      <w:r>
+        <w:rPr>
+          <w:rFonts w:ascii="Apple Color Emoji" w:hAnsi="Apple Color Emoji" w:cs="Apple Color Emoji"/>
+          <w:lang w:val="en-US"/>
+        </w:rPr>
+        <w:t>🔨</w:t>
+      </w:r>
+      <w:r>
+        <w:rPr>
+          <w:lang w:val="en-US"/>
+        </w:rPr>
+        <w:t xml:space="preserve">  {desc}…")</w:t>
+      </w:r>
+    </w:p>
+    <w:p>
+      <w:pPr>
+        <w:pStyle w:val="ListParagraph"/>
+        <w:rPr>
+          <w:lang w:val="en-US"/>
+        </w:rPr>
+      </w:pPr>
+      <w:r>
+        <w:rPr>
+          <w:lang w:val="en-US"/>
+        </w:rPr>
+        <w:t xml:space="preserve">    rc = subprocess.call([sys.executable, "-m", module], cwd=BASE_DIR)</w:t>
+      </w:r>
+    </w:p>
+    <w:p>
+      <w:pPr>
+        <w:pStyle w:val="ListParagraph"/>
+        <w:rPr>
+          <w:lang w:val="en-US"/>
+        </w:rPr>
+      </w:pPr>
+      <w:r>
+        <w:rPr>
+          <w:lang w:val="en-US"/>
+        </w:rPr>
+        <w:t xml:space="preserve">    if rc:</w:t>
+      </w:r>
+    </w:p>
+    <w:p>
+      <w:pPr>
+        <w:pStyle w:val="ListParagraph"/>
+        <w:rPr>
+          <w:lang w:val="en-US"/>
+        </w:rPr>
+      </w:pPr>
+      <w:r>
+        <w:rPr>
+          <w:lang w:val="en-US"/>
+        </w:rPr>
+        <w:t xml:space="preserve">        logger.error(f"{desc} failed (exit {rc}); aborting.")</w:t>
+      </w:r>
+    </w:p>
+    <w:p>
+      <w:pPr>
+        <w:pStyle w:val="ListParagraph"/>
+        <w:rPr>
+          <w:lang w:val="en-US"/>
+        </w:rPr>
+      </w:pPr>
+      <w:r>
+        <w:rPr>
+          <w:lang w:val="en-US"/>
+        </w:rPr>
+        <w:t xml:space="preserve">        sys.exit(1)</w:t>
+      </w:r>
+    </w:p>
+    <w:p>
+      <w:pPr>
+        <w:pStyle w:val="ListParagraph"/>
+        <w:rPr>
+          <w:lang w:val="en-US"/>
+        </w:rPr>
+      </w:pPr>
+      <w:r>
+        <w:rPr>
+          <w:lang w:val="en-US"/>
+        </w:rPr>
+        <w:t xml:space="preserve">    logger.info(f"</w:t>
+      </w:r>
+      <w:r>
+        <w:rPr>
+          <w:rFonts w:ascii="Apple Color Emoji" w:hAnsi="Apple Color Emoji" w:cs="Apple Color Emoji"/>
+          <w:lang w:val="en-US"/>
+        </w:rPr>
+        <w:t>✅</w:t>
+      </w:r>
+      <w:r>
+        <w:rPr>
+          <w:lang w:val="en-US"/>
+        </w:rPr>
+        <w:t xml:space="preserve">  {desc} completed.")</w:t>
+      </w:r>
+    </w:p>
+    <w:p>
+      <w:pPr>
+        <w:pStyle w:val="ListParagraph"/>
+        <w:rPr>
+          <w:lang w:val="en-US"/>
+        </w:rPr>
+      </w:pPr>
+    </w:p>
+    <w:p>
+      <w:pPr>
+        <w:pStyle w:val="ListParagraph"/>
+        <w:rPr>
+          <w:lang w:val="en-US"/>
+        </w:rPr>
+      </w:pPr>
+    </w:p>
+    <w:p>
+      <w:pPr>
+        <w:pStyle w:val="ListParagraph"/>
+        <w:rPr>
+          <w:lang w:val="en-US"/>
+        </w:rPr>
+      </w:pPr>
+      <w:r>
+        <w:rPr>
+          <w:lang w:val="en-US"/>
+        </w:rPr>
+        <w:t># ─── 0) Refresh your symbol list ──────────────────────────────────────────────</w:t>
+      </w:r>
+    </w:p>
+    <w:p>
+      <w:pPr>
+        <w:pStyle w:val="ListParagraph"/>
+        <w:rPr>
+          <w:lang w:val="en-US"/>
+        </w:rPr>
+      </w:pPr>
+      <w:r>
+        <w:rPr>
+          <w:lang w:val="en-US"/>
+        </w:rPr>
+        <w:t>run_script(UPDATE_SYMBOLS, "Updating symbols.json")</w:t>
+      </w:r>
+    </w:p>
+    <w:p>
+      <w:pPr>
+        <w:pStyle w:val="ListParagraph"/>
+        <w:rPr>
+          <w:lang w:val="en-US"/>
+        </w:rPr>
+      </w:pPr>
+    </w:p>
+    <w:p>
+      <w:pPr>
+        <w:pStyle w:val="ListParagraph"/>
+        <w:rPr>
+          <w:lang w:val="en-US"/>
+        </w:rPr>
+      </w:pPr>
+      <w:r>
+        <w:rPr>
+          <w:lang w:val="en-US"/>
+        </w:rPr>
+        <w:t># ─── 1) Build the merged_training_data via your ETL ──────────────────────────</w:t>
+      </w:r>
+    </w:p>
+    <w:p>
+      <w:pPr>
+        <w:pStyle w:val="ListParagraph"/>
+        <w:rPr>
+          <w:lang w:val="en-US"/>
+        </w:rPr>
+      </w:pPr>
+      <w:r>
+        <w:rPr>
+          <w:lang w:val="en-US"/>
+        </w:rPr>
+        <w:t>run_module(GENERATE_MODULE, "Generating merged_training_data")</w:t>
+      </w:r>
+    </w:p>
+    <w:p>
+      <w:pPr>
+        <w:pStyle w:val="ListParagraph"/>
+        <w:rPr>
+          <w:lang w:val="en-US"/>
+        </w:rPr>
+      </w:pPr>
+    </w:p>
+    <w:p>
+      <w:pPr>
+        <w:pStyle w:val="ListParagraph"/>
+        <w:rPr>
+          <w:lang w:val="en-US"/>
+        </w:rPr>
+      </w:pPr>
+      <w:r>
+        <w:rPr>
+          <w:lang w:val="en-US"/>
+        </w:rPr>
+        <w:t># ─── 2) If linear model missing, train one ────────────────────────────────────</w:t>
       </w:r>
     </w:p>
     <w:p>
@@ -877,55 +1088,29 @@
         <w:rPr>
           <w:lang w:val="en-US"/>
         </w:rPr>
-        <w:t xml:space="preserve">    run_script(TRAINER_LINEAR, "Offline linear trainer")</w:t>
-      </w:r>
-    </w:p>
-    <w:p>
-      <w:pPr>
-        <w:pStyle w:val="ListParagraph"/>
-        <w:rPr>
-          <w:lang w:val="en-US"/>
-        </w:rPr>
-      </w:pPr>
-    </w:p>
-    <w:p>
-      <w:pPr>
-        <w:pStyle w:val="ListParagraph"/>
-        <w:rPr>
-          <w:lang w:val="en-US"/>
-        </w:rPr>
-      </w:pPr>
-      <w:r>
-        <w:rPr>
-          <w:lang w:val="en-US"/>
-        </w:rPr>
-        <w:t># ─── Step</w:t>
-      </w:r>
-      <w:r>
-        <w:rPr>
-          <w:rFonts w:ascii="Arial" w:hAnsi="Arial" w:cs="Arial"/>
-          <w:lang w:val="en-US"/>
-        </w:rPr>
-        <w:t> </w:t>
-      </w:r>
-      <w:r>
-        <w:rPr>
-          <w:lang w:val="en-US"/>
-        </w:rPr>
-        <w:t>3: Bootstrap neural</w:t>
-      </w:r>
-      <w:r>
-        <w:rPr>
-          <w:rFonts w:ascii="Cambria Math" w:hAnsi="Cambria Math" w:cs="Cambria Math"/>
-          <w:lang w:val="en-US"/>
-        </w:rPr>
-        <w:t>‑</w:t>
-      </w:r>
-      <w:r>
-        <w:rPr>
-          <w:lang w:val="en-US"/>
-        </w:rPr>
-        <w:t>net model if missing ────────────────────────────</w:t>
+        <w:t xml:space="preserve">    run_module(LINEAR_MODULE, "Offline linear trainer")</w:t>
+      </w:r>
+    </w:p>
+    <w:p>
+      <w:pPr>
+        <w:pStyle w:val="ListParagraph"/>
+        <w:rPr>
+          <w:lang w:val="en-US"/>
+        </w:rPr>
+      </w:pPr>
+    </w:p>
+    <w:p>
+      <w:pPr>
+        <w:pStyle w:val="ListParagraph"/>
+        <w:rPr>
+          <w:lang w:val="en-US"/>
+        </w:rPr>
+      </w:pPr>
+      <w:r>
+        <w:rPr>
+          <w:lang w:val="en-US"/>
+        </w:rPr>
+        <w:t># ─── 3) If NN model missing, train one ────────────────────────────────────────</w:t>
       </w:r>
     </w:p>
     <w:p>
@@ -953,55 +1138,29 @@
         <w:rPr>
           <w:lang w:val="en-US"/>
         </w:rPr>
-        <w:t xml:space="preserve">    run_script(TRAINER_NN, "Offline NN trainer")</w:t>
-      </w:r>
-    </w:p>
-    <w:p>
-      <w:pPr>
-        <w:pStyle w:val="ListParagraph"/>
-        <w:rPr>
-          <w:lang w:val="en-US"/>
-        </w:rPr>
-      </w:pPr>
-    </w:p>
-    <w:p>
-      <w:pPr>
-        <w:pStyle w:val="ListParagraph"/>
-        <w:rPr>
-          <w:lang w:val="en-US"/>
-        </w:rPr>
-      </w:pPr>
-      <w:r>
-        <w:rPr>
-          <w:lang w:val="en-US"/>
-        </w:rPr>
-        <w:t># ─── Step</w:t>
-      </w:r>
-      <w:r>
-        <w:rPr>
-          <w:rFonts w:ascii="Arial" w:hAnsi="Arial" w:cs="Arial"/>
-          <w:lang w:val="en-US"/>
-        </w:rPr>
-        <w:t> </w:t>
-      </w:r>
-      <w:r>
-        <w:rPr>
-          <w:lang w:val="en-US"/>
-        </w:rPr>
-        <w:t>4: Auto</w:t>
-      </w:r>
-      <w:r>
-        <w:rPr>
-          <w:rFonts w:ascii="Cambria Math" w:hAnsi="Cambria Math" w:cs="Cambria Math"/>
-          <w:lang w:val="en-US"/>
-        </w:rPr>
-        <w:t>‑</w:t>
-      </w:r>
-      <w:r>
-        <w:rPr>
-          <w:lang w:val="en-US"/>
-        </w:rPr>
-        <w:t>switch active model ─────────────────────────────────────────</w:t>
+        <w:t xml:space="preserve">    run_module(NN_MODULE, "Offline NN trainer")</w:t>
+      </w:r>
+    </w:p>
+    <w:p>
+      <w:pPr>
+        <w:pStyle w:val="ListParagraph"/>
+        <w:rPr>
+          <w:lang w:val="en-US"/>
+        </w:rPr>
+      </w:pPr>
+    </w:p>
+    <w:p>
+      <w:pPr>
+        <w:pStyle w:val="ListParagraph"/>
+        <w:rPr>
+          <w:lang w:val="en-US"/>
+        </w:rPr>
+      </w:pPr>
+      <w:r>
+        <w:rPr>
+          <w:lang w:val="en-US"/>
+        </w:rPr>
+        <w:t># ─── 4) Evaluate &amp; switch active model ───────────────────────────────────────</w:t>
       </w:r>
     </w:p>
     <w:p>
@@ -1028,49 +1187,49 @@
         <w:rPr>
           <w:lang w:val="en-US"/>
         </w:rPr>
-        <w:t xml:space="preserve">  Evaluating &amp; switching active model if needed…")</w:t>
-      </w:r>
-    </w:p>
-    <w:p>
-      <w:pPr>
-        <w:pStyle w:val="ListParagraph"/>
-        <w:rPr>
-          <w:lang w:val="en-US"/>
-        </w:rPr>
-      </w:pPr>
-      <w:r>
-        <w:rPr>
-          <w:lang w:val="en-US"/>
-        </w:rPr>
-        <w:t>rc = subprocess.call([sys.executable, EVAL_SWITCH_SCRIPT], cwd=BASE_DIR)</w:t>
-      </w:r>
-    </w:p>
-    <w:p>
-      <w:pPr>
-        <w:pStyle w:val="ListParagraph"/>
-        <w:rPr>
-          <w:lang w:val="en-US"/>
-        </w:rPr>
-      </w:pPr>
-      <w:r>
-        <w:rPr>
-          <w:lang w:val="en-US"/>
-        </w:rPr>
-        <w:t>if rc != 0:</w:t>
-      </w:r>
-    </w:p>
-    <w:p>
-      <w:pPr>
-        <w:pStyle w:val="ListParagraph"/>
-        <w:rPr>
-          <w:lang w:val="en-US"/>
-        </w:rPr>
-      </w:pPr>
-      <w:r>
-        <w:rPr>
-          <w:lang w:val="en-US"/>
-        </w:rPr>
-        <w:t xml:space="preserve">    logger.warning(f"`evaluate_and_switch.py` exited with code {rc}; keeping existing active_model.txt")</w:t>
+        <w:t xml:space="preserve">  Evaluating &amp; switching active model…")</w:t>
+      </w:r>
+    </w:p>
+    <w:p>
+      <w:pPr>
+        <w:pStyle w:val="ListParagraph"/>
+        <w:rPr>
+          <w:lang w:val="en-US"/>
+        </w:rPr>
+      </w:pPr>
+      <w:r>
+        <w:rPr>
+          <w:lang w:val="en-US"/>
+        </w:rPr>
+        <w:t>rc = subprocess.call([sys.executable, "-m", SWITCH_MODULE], cwd=BASE_DIR)</w:t>
+      </w:r>
+    </w:p>
+    <w:p>
+      <w:pPr>
+        <w:pStyle w:val="ListParagraph"/>
+        <w:rPr>
+          <w:lang w:val="en-US"/>
+        </w:rPr>
+      </w:pPr>
+      <w:r>
+        <w:rPr>
+          <w:lang w:val="en-US"/>
+        </w:rPr>
+        <w:t>if rc:</w:t>
+      </w:r>
+    </w:p>
+    <w:p>
+      <w:pPr>
+        <w:pStyle w:val="ListParagraph"/>
+        <w:rPr>
+          <w:lang w:val="en-US"/>
+        </w:rPr>
+      </w:pPr>
+      <w:r>
+        <w:rPr>
+          <w:lang w:val="en-US"/>
+        </w:rPr>
+        <w:t xml:space="preserve">    logger.warning(f"evaluate_and_switch exited {rc}; keeping current model.")</w:t>
       </w:r>
     </w:p>
     <w:p>
@@ -1111,29 +1270,37 @@
         <w:rPr>
           <w:lang w:val="en-US"/>
         </w:rPr>
-        <w:t xml:space="preserve">  `evaluate_and_switch.py` ran successfully.")</w:t>
-      </w:r>
-    </w:p>
-    <w:p>
-      <w:pPr>
-        <w:pStyle w:val="ListParagraph"/>
-        <w:rPr>
-          <w:lang w:val="en-US"/>
-        </w:rPr>
-      </w:pPr>
-    </w:p>
-    <w:p>
-      <w:pPr>
-        <w:pStyle w:val="ListParagraph"/>
-        <w:rPr>
-          <w:lang w:val="en-US"/>
-        </w:rPr>
-      </w:pPr>
-      <w:r>
-        <w:rPr>
-          <w:lang w:val="en-US"/>
-        </w:rPr>
-        <w:t># ─── Daemons under master ────────────────────────────────────────────────────</w:t>
+        <w:t xml:space="preserve">  Model switch step completed.")</w:t>
+      </w:r>
+    </w:p>
+    <w:p>
+      <w:pPr>
+        <w:pStyle w:val="ListParagraph"/>
+        <w:rPr>
+          <w:lang w:val="en-US"/>
+        </w:rPr>
+      </w:pPr>
+    </w:p>
+    <w:p>
+      <w:pPr>
+        <w:pStyle w:val="ListParagraph"/>
+        <w:rPr>
+          <w:lang w:val="en-US"/>
+        </w:rPr>
+      </w:pPr>
+    </w:p>
+    <w:p>
+      <w:pPr>
+        <w:pStyle w:val="ListParagraph"/>
+        <w:rPr>
+          <w:lang w:val="en-US"/>
+        </w:rPr>
+      </w:pPr>
+      <w:r>
+        <w:rPr>
+          <w:lang w:val="en-US"/>
+        </w:rPr>
+        <w:t># ─── 5) Daemons: mix of file scripts and modules ───────────────────────────────</w:t>
       </w:r>
     </w:p>
     <w:p>
@@ -1161,63 +1328,63 @@
         <w:rPr>
           <w:lang w:val="en-US"/>
         </w:rPr>
-        <w:t xml:space="preserve">    "update_symbols":     UPDATE_SYMBOLS_SCRIPT,</w:t>
-      </w:r>
-    </w:p>
-    <w:p>
-      <w:pPr>
-        <w:pStyle w:val="ListParagraph"/>
-        <w:rPr>
-          <w:lang w:val="en-US"/>
-        </w:rPr>
-      </w:pPr>
-      <w:r>
-        <w:rPr>
-          <w:lang w:val="en-US"/>
-        </w:rPr>
-        <w:t xml:space="preserve">    "vib_extras":         os.path.join(BASE_DIR, "data", "vib_extras.py"),</w:t>
-      </w:r>
-    </w:p>
-    <w:p>
-      <w:pPr>
-        <w:pStyle w:val="ListParagraph"/>
-        <w:rPr>
-          <w:lang w:val="en-US"/>
-        </w:rPr>
-      </w:pPr>
-      <w:r>
-        <w:rPr>
-          <w:lang w:val="en-US"/>
-        </w:rPr>
-        <w:t xml:space="preserve">    "multi_socket":       os.path.join(BASE_DIR, "realtime", "multi_socket.py"),</w:t>
-      </w:r>
-    </w:p>
-    <w:p>
-      <w:pPr>
-        <w:pStyle w:val="ListParagraph"/>
-        <w:rPr>
-          <w:lang w:val="en-US"/>
-        </w:rPr>
-      </w:pPr>
-      <w:r>
-        <w:rPr>
-          <w:lang w:val="en-US"/>
-        </w:rPr>
-        <w:t xml:space="preserve">    "vib_master":         os.path.join(BASE_DIR, "realtime", "vib_master.py"),</w:t>
-      </w:r>
-    </w:p>
-    <w:p>
-      <w:pPr>
-        <w:pStyle w:val="ListParagraph"/>
-        <w:rPr>
-          <w:lang w:val="en-US"/>
-        </w:rPr>
-      </w:pPr>
-      <w:r>
-        <w:rPr>
-          <w:lang w:val="en-US"/>
-        </w:rPr>
-        <w:t xml:space="preserve">    "train_model_online": os.path.join(BASE_DIR, "models", "train_model_online_enhanced.py"),</w:t>
+        <w:t xml:space="preserve">    "update_symbols": UPDATE_SYMBOLS,</w:t>
+      </w:r>
+    </w:p>
+    <w:p>
+      <w:pPr>
+        <w:pStyle w:val="ListParagraph"/>
+        <w:rPr>
+          <w:lang w:val="en-US"/>
+        </w:rPr>
+      </w:pPr>
+      <w:r>
+        <w:rPr>
+          <w:lang w:val="en-US"/>
+        </w:rPr>
+        <w:t xml:space="preserve">    "vib_extras":     ("module", "vib_bot.data.vib_extras"),</w:t>
+      </w:r>
+    </w:p>
+    <w:p>
+      <w:pPr>
+        <w:pStyle w:val="ListParagraph"/>
+        <w:rPr>
+          <w:lang w:val="en-US"/>
+        </w:rPr>
+      </w:pPr>
+      <w:r>
+        <w:rPr>
+          <w:lang w:val="en-US"/>
+        </w:rPr>
+        <w:t xml:space="preserve">    "multi_socket":   ("module", "vib_bot.realtime.multi_socket"),</w:t>
+      </w:r>
+    </w:p>
+    <w:p>
+      <w:pPr>
+        <w:pStyle w:val="ListParagraph"/>
+        <w:rPr>
+          <w:lang w:val="en-US"/>
+        </w:rPr>
+      </w:pPr>
+      <w:r>
+        <w:rPr>
+          <w:lang w:val="en-US"/>
+        </w:rPr>
+        <w:t xml:space="preserve">    "vib_master":     ("module", "vib_bot.realtime.vib_master"),</w:t>
+      </w:r>
+    </w:p>
+    <w:p>
+      <w:pPr>
+        <w:pStyle w:val="ListParagraph"/>
+        <w:rPr>
+          <w:lang w:val="en-US"/>
+        </w:rPr>
+      </w:pPr>
+      <w:r>
+        <w:rPr>
+          <w:lang w:val="en-US"/>
+        </w:rPr>
+        <w:t xml:space="preserve">    "train_online":   ("module", "vib_bot.models.train_model_online_enhanced"),</w:t>
       </w:r>
     </w:p>
     <w:p>
@@ -1245,7 +1412,7 @@
         <w:rPr>
           <w:lang w:val="en-US"/>
         </w:rPr>
-        <w:t>LOG_FILES = {name: os.path.join(BASE_DIR, f"{name}.log") for name in SCRIPTS}</w:t>
+        <w:t>LOGS = {name: os.path.join(BASE_DIR, f"{name}.log") for name in SCRIPTS}</w:t>
       </w:r>
     </w:p>
     <w:p>
@@ -1277,11 +1444,19 @@
           <w:lang w:val="en-US"/>
         </w:rPr>
       </w:pPr>
-      <w:r>
-        <w:rPr>
-          <w:lang w:val="en-US"/>
-        </w:rPr>
-        <w:t>def start_script(name, path, log_path):</w:t>
+    </w:p>
+    <w:p>
+      <w:pPr>
+        <w:pStyle w:val="ListParagraph"/>
+        <w:rPr>
+          <w:lang w:val="en-US"/>
+        </w:rPr>
+      </w:pPr>
+      <w:r>
+        <w:rPr>
+          <w:lang w:val="en-US"/>
+        </w:rPr>
+        <w:t>def start_service(name, entry, logpath):</w:t>
       </w:r>
     </w:p>
     <w:p>
@@ -1309,21 +1484,77 @@
         <w:rPr>
           <w:lang w:val="en-US"/>
         </w:rPr>
-        <w:t xml:space="preserve">    f = open(log_path, "a", buffering=1)</w:t>
-      </w:r>
-    </w:p>
-    <w:p>
-      <w:pPr>
-        <w:pStyle w:val="ListParagraph"/>
-        <w:rPr>
-          <w:lang w:val="en-US"/>
-        </w:rPr>
-      </w:pPr>
-      <w:r>
-        <w:rPr>
-          <w:lang w:val="en-US"/>
-        </w:rPr>
-        <w:t xml:space="preserve">    p = subprocess.Popen([sys.executable, "-u", path], stdout=f, stderr=f, cwd=BASE_DIR)</w:t>
+        <w:t xml:space="preserve">    f = open(logpath, "a", buffering=1)</w:t>
+      </w:r>
+    </w:p>
+    <w:p>
+      <w:pPr>
+        <w:pStyle w:val="ListParagraph"/>
+        <w:rPr>
+          <w:lang w:val="en-US"/>
+        </w:rPr>
+      </w:pPr>
+      <w:r>
+        <w:rPr>
+          <w:lang w:val="en-US"/>
+        </w:rPr>
+        <w:t xml:space="preserve">    if isinstance(entry, tuple) and entry[0] == "module":</w:t>
+      </w:r>
+    </w:p>
+    <w:p>
+      <w:pPr>
+        <w:pStyle w:val="ListParagraph"/>
+        <w:rPr>
+          <w:lang w:val="en-US"/>
+        </w:rPr>
+      </w:pPr>
+      <w:r>
+        <w:rPr>
+          <w:lang w:val="en-US"/>
+        </w:rPr>
+        <w:t xml:space="preserve">        cmd = [sys.executable, "-u", "-m", entry[1]]</w:t>
+      </w:r>
+    </w:p>
+    <w:p>
+      <w:pPr>
+        <w:pStyle w:val="ListParagraph"/>
+        <w:rPr>
+          <w:lang w:val="en-US"/>
+        </w:rPr>
+      </w:pPr>
+      <w:r>
+        <w:rPr>
+          <w:lang w:val="en-US"/>
+        </w:rPr>
+        <w:t xml:space="preserve">    else:</w:t>
+      </w:r>
+    </w:p>
+    <w:p>
+      <w:pPr>
+        <w:pStyle w:val="ListParagraph"/>
+        <w:rPr>
+          <w:lang w:val="en-US"/>
+        </w:rPr>
+      </w:pPr>
+      <w:r>
+        <w:rPr>
+          <w:lang w:val="en-US"/>
+        </w:rPr>
+        <w:t xml:space="preserve">        cmd = [sys.executable, "-u", entry]</w:t>
+      </w:r>
+    </w:p>
+    <w:p>
+      <w:pPr>
+        <w:pStyle w:val="ListParagraph"/>
+        <w:rPr>
+          <w:lang w:val="en-US"/>
+        </w:rPr>
+      </w:pPr>
+      <w:r>
+        <w:rPr>
+          <w:lang w:val="en-US"/>
+        </w:rPr>
+        <w:t xml:space="preserve">    p = subprocess.Popen(cmd, cwd=BASE_DIR, stdout=f, stderr=f)</w:t>
       </w:r>
     </w:p>
     <w:p>
@@ -1355,6 +1586,14 @@
           <w:lang w:val="en-US"/>
         </w:rPr>
       </w:pPr>
+    </w:p>
+    <w:p>
+      <w:pPr>
+        <w:pStyle w:val="ListParagraph"/>
+        <w:rPr>
+          <w:lang w:val="en-US"/>
+        </w:rPr>
+      </w:pPr>
       <w:r>
         <w:rPr>
           <w:lang w:val="en-US"/>
@@ -1443,7 +1682,7 @@
         <w:rPr>
           <w:lang w:val="en-US"/>
         </w:rPr>
-        <w:t xml:space="preserve">                start_script(name, SCRIPTS[name], LOG_FILES[name])</w:t>
+        <w:t xml:space="preserve">                start_service(name, SCRIPTS[name], LOGS[name])</w:t>
       </w:r>
     </w:p>
     <w:p>
@@ -1475,11 +1714,19 @@
           <w:lang w:val="en-US"/>
         </w:rPr>
       </w:pPr>
-      <w:r>
-        <w:rPr>
-          <w:lang w:val="en-US"/>
-        </w:rPr>
-        <w:t>def shutdown(signum, frame):</w:t>
+    </w:p>
+    <w:p>
+      <w:pPr>
+        <w:pStyle w:val="ListParagraph"/>
+        <w:rPr>
+          <w:lang w:val="en-US"/>
+        </w:rPr>
+      </w:pPr>
+      <w:r>
+        <w:rPr>
+          <w:lang w:val="en-US"/>
+        </w:rPr>
+        <w:t>def shutdown(sig, frame):</w:t>
       </w:r>
     </w:p>
     <w:p>
@@ -1567,25 +1814,6 @@
           <w:lang w:val="en-US"/>
         </w:rPr>
       </w:pPr>
-      <w:r>
-        <w:rPr>
-          <w:lang w:val="en-US"/>
-        </w:rPr>
-        <w:t># Trap SIGINT/SIGTERM so Ctrl</w:t>
-      </w:r>
-      <w:r>
-        <w:rPr>
-          <w:rFonts w:ascii="Cambria Math" w:hAnsi="Cambria Math" w:cs="Cambria Math"/>
-          <w:lang w:val="en-US"/>
-        </w:rPr>
-        <w:t>‑</w:t>
-      </w:r>
-      <w:r>
-        <w:rPr>
-          <w:lang w:val="en-US"/>
-        </w:rPr>
-        <w:t>C cleans up children</w:t>
-      </w:r>
     </w:p>
     <w:p>
       <w:pPr>
@@ -1630,6 +1858,14 @@
           <w:lang w:val="en-US"/>
         </w:rPr>
       </w:pPr>
+    </w:p>
+    <w:p>
+      <w:pPr>
+        <w:pStyle w:val="ListParagraph"/>
+        <w:rPr>
+          <w:lang w:val="en-US"/>
+        </w:rPr>
+      </w:pPr>
       <w:r>
         <w:rPr>
           <w:lang w:val="en-US"/>
@@ -1648,35 +1884,35 @@
         <w:rPr>
           <w:lang w:val="en-US"/>
         </w:rPr>
-        <w:t xml:space="preserve">    logger.info("[MASTER] Launching all managed scripts")</w:t>
-      </w:r>
-    </w:p>
-    <w:p>
-      <w:pPr>
-        <w:pStyle w:val="ListParagraph"/>
-        <w:rPr>
-          <w:lang w:val="en-US"/>
-        </w:rPr>
-      </w:pPr>
-      <w:r>
-        <w:rPr>
-          <w:lang w:val="en-US"/>
-        </w:rPr>
-        <w:t xml:space="preserve">    for name, path in SCRIPTS.items():</w:t>
-      </w:r>
-    </w:p>
-    <w:p>
-      <w:pPr>
-        <w:pStyle w:val="ListParagraph"/>
-        <w:rPr>
-          <w:lang w:val="en-US"/>
-        </w:rPr>
-      </w:pPr>
-      <w:r>
-        <w:rPr>
-          <w:lang w:val="en-US"/>
-        </w:rPr>
-        <w:t xml:space="preserve">        start_script(name, path, LOG_FILES[name])</w:t>
+        <w:t xml:space="preserve">    logger.info("[MASTER] Launching managed services…")</w:t>
+      </w:r>
+    </w:p>
+    <w:p>
+      <w:pPr>
+        <w:pStyle w:val="ListParagraph"/>
+        <w:rPr>
+          <w:lang w:val="en-US"/>
+        </w:rPr>
+      </w:pPr>
+      <w:r>
+        <w:rPr>
+          <w:lang w:val="en-US"/>
+        </w:rPr>
+        <w:t xml:space="preserve">    for name, entry in SCRIPTS.items():</w:t>
+      </w:r>
+    </w:p>
+    <w:p>
+      <w:pPr>
+        <w:pStyle w:val="ListParagraph"/>
+        <w:rPr>
+          <w:lang w:val="en-US"/>
+        </w:rPr>
+      </w:pPr>
+      <w:r>
+        <w:rPr>
+          <w:lang w:val="en-US"/>
+        </w:rPr>
+        <w:t xml:space="preserve">        start_service(name, entry, LOGS[name])</w:t>
       </w:r>
     </w:p>
     <w:p>
@@ -1692,14 +1928,6 @@
         </w:rPr>
         <w:t xml:space="preserve">    monitor()</w:t>
       </w:r>
-    </w:p>
-    <w:p>
-      <w:pPr>
-        <w:pStyle w:val="ListParagraph"/>
-        <w:rPr>
-          <w:lang w:val="en-US"/>
-        </w:rPr>
-      </w:pPr>
     </w:p>
     <w:p>
       <w:pPr>
@@ -24353,7 +24581,835 @@
         <w:rPr>
           <w:lang w:val="en-US"/>
         </w:rPr>
-        <w:t># Base &amp; Sub</w:t>
+        <w:t># Directories</w:t>
+      </w:r>
+    </w:p>
+    <w:p>
+      <w:pPr>
+        <w:pStyle w:val="ListParagraph"/>
+        <w:rPr>
+          <w:lang w:val="en-US"/>
+        </w:rPr>
+      </w:pPr>
+      <w:r>
+        <w:rPr>
+          <w:lang w:val="en-US"/>
+        </w:rPr>
+        <w:t># ────────────────────────────────────────────────────────────────────────────────</w:t>
+      </w:r>
+    </w:p>
+    <w:p>
+      <w:pPr>
+        <w:pStyle w:val="ListParagraph"/>
+        <w:rPr>
+          <w:lang w:val="en-US"/>
+        </w:rPr>
+      </w:pPr>
+      <w:r>
+        <w:rPr>
+          <w:lang w:val="en-US"/>
+        </w:rPr>
+        <w:t>PACKAGE_DIR     = os.path.dirname(__file__)</w:t>
+      </w:r>
+    </w:p>
+    <w:p>
+      <w:pPr>
+        <w:pStyle w:val="ListParagraph"/>
+        <w:rPr>
+          <w:lang w:val="en-US"/>
+        </w:rPr>
+      </w:pPr>
+      <w:r>
+        <w:rPr>
+          <w:lang w:val="en-US"/>
+        </w:rPr>
+        <w:t># project root is one level above the package directory</w:t>
+      </w:r>
+    </w:p>
+    <w:p>
+      <w:pPr>
+        <w:pStyle w:val="ListParagraph"/>
+        <w:rPr>
+          <w:lang w:val="en-US"/>
+        </w:rPr>
+      </w:pPr>
+      <w:r>
+        <w:rPr>
+          <w:lang w:val="en-US"/>
+        </w:rPr>
+        <w:t>BASE_DIR        = os.getenv(</w:t>
+      </w:r>
+    </w:p>
+    <w:p>
+      <w:pPr>
+        <w:pStyle w:val="ListParagraph"/>
+        <w:rPr>
+          <w:lang w:val="en-US"/>
+        </w:rPr>
+      </w:pPr>
+      <w:r>
+        <w:rPr>
+          <w:lang w:val="en-US"/>
+        </w:rPr>
+        <w:t xml:space="preserve">    "VIB_BOT_BASE_DIR",</w:t>
+      </w:r>
+    </w:p>
+    <w:p>
+      <w:pPr>
+        <w:pStyle w:val="ListParagraph"/>
+        <w:rPr>
+          <w:lang w:val="en-US"/>
+        </w:rPr>
+      </w:pPr>
+      <w:r>
+        <w:rPr>
+          <w:lang w:val="en-US"/>
+        </w:rPr>
+        <w:t xml:space="preserve">    os.path.abspath(os.path.join(PACKAGE_DIR, os.pardir))</w:t>
+      </w:r>
+    </w:p>
+    <w:p>
+      <w:pPr>
+        <w:pStyle w:val="ListParagraph"/>
+        <w:rPr>
+          <w:lang w:val="en-US"/>
+        </w:rPr>
+      </w:pPr>
+      <w:r>
+        <w:rPr>
+          <w:lang w:val="en-US"/>
+        </w:rPr>
+        <w:t>)</w:t>
+      </w:r>
+    </w:p>
+    <w:p>
+      <w:pPr>
+        <w:pStyle w:val="ListParagraph"/>
+        <w:rPr>
+          <w:lang w:val="en-US"/>
+        </w:rPr>
+      </w:pPr>
+    </w:p>
+    <w:p>
+      <w:pPr>
+        <w:pStyle w:val="ListParagraph"/>
+        <w:rPr>
+          <w:lang w:val="en-US"/>
+        </w:rPr>
+      </w:pPr>
+      <w:r>
+        <w:rPr>
+          <w:lang w:val="en-US"/>
+        </w:rPr>
+        <w:t># code folders inside the package</w:t>
+      </w:r>
+    </w:p>
+    <w:p>
+      <w:pPr>
+        <w:pStyle w:val="ListParagraph"/>
+        <w:rPr>
+          <w:lang w:val="en-US"/>
+        </w:rPr>
+      </w:pPr>
+      <w:r>
+        <w:rPr>
+          <w:lang w:val="en-US"/>
+        </w:rPr>
+        <w:t>DATA_DIR        = os.path.join(PACKAGE_DIR, "data")</w:t>
+      </w:r>
+    </w:p>
+    <w:p>
+      <w:pPr>
+        <w:pStyle w:val="ListParagraph"/>
+        <w:rPr>
+          <w:lang w:val="en-US"/>
+        </w:rPr>
+      </w:pPr>
+      <w:r>
+        <w:rPr>
+          <w:lang w:val="en-US"/>
+        </w:rPr>
+        <w:t>PROCESSING_DIR  = os.path.join(PACKAGE_DIR, "processing")</w:t>
+      </w:r>
+    </w:p>
+    <w:p>
+      <w:pPr>
+        <w:pStyle w:val="ListParagraph"/>
+        <w:rPr>
+          <w:lang w:val="en-US"/>
+        </w:rPr>
+      </w:pPr>
+      <w:r>
+        <w:rPr>
+          <w:lang w:val="en-US"/>
+        </w:rPr>
+        <w:t>MODELS_DIR      = os.path.join(PACKAGE_DIR, "models")</w:t>
+      </w:r>
+    </w:p>
+    <w:p>
+      <w:pPr>
+        <w:pStyle w:val="ListParagraph"/>
+        <w:rPr>
+          <w:lang w:val="en-US"/>
+        </w:rPr>
+      </w:pPr>
+      <w:r>
+        <w:rPr>
+          <w:lang w:val="en-US"/>
+        </w:rPr>
+        <w:t>REALTIME_DIR    = os.path.join(PACKAGE_DIR, "realtime")</w:t>
+      </w:r>
+    </w:p>
+    <w:p>
+      <w:pPr>
+        <w:pStyle w:val="ListParagraph"/>
+        <w:rPr>
+          <w:lang w:val="en-US"/>
+        </w:rPr>
+      </w:pPr>
+      <w:r>
+        <w:rPr>
+          <w:lang w:val="en-US"/>
+        </w:rPr>
+        <w:t>BACKTEST_DIR    = os.path.join(PACKAGE_DIR, "backtest")</w:t>
+      </w:r>
+    </w:p>
+    <w:p>
+      <w:pPr>
+        <w:pStyle w:val="ListParagraph"/>
+        <w:rPr>
+          <w:lang w:val="en-US"/>
+        </w:rPr>
+      </w:pPr>
+      <w:r>
+        <w:rPr>
+          <w:lang w:val="en-US"/>
+        </w:rPr>
+        <w:t>MONITORING_DIR  = os.path.join(PACKAGE_DIR, "monitoring")</w:t>
+      </w:r>
+    </w:p>
+    <w:p>
+      <w:pPr>
+        <w:pStyle w:val="ListParagraph"/>
+        <w:rPr>
+          <w:lang w:val="en-US"/>
+        </w:rPr>
+      </w:pPr>
+      <w:r>
+        <w:rPr>
+          <w:lang w:val="en-US"/>
+        </w:rPr>
+        <w:t>UTILS_DIR       = os.path.join(PACKAGE_DIR, "utils")</w:t>
+      </w:r>
+    </w:p>
+    <w:p>
+      <w:pPr>
+        <w:pStyle w:val="ListParagraph"/>
+        <w:rPr>
+          <w:lang w:val="en-US"/>
+        </w:rPr>
+      </w:pPr>
+    </w:p>
+    <w:p>
+      <w:pPr>
+        <w:pStyle w:val="ListParagraph"/>
+        <w:rPr>
+          <w:lang w:val="en-US"/>
+        </w:rPr>
+      </w:pPr>
+      <w:r>
+        <w:rPr>
+          <w:lang w:val="en-US"/>
+        </w:rPr>
+        <w:t># scripts and tests folders at project root</w:t>
+      </w:r>
+    </w:p>
+    <w:p>
+      <w:pPr>
+        <w:pStyle w:val="ListParagraph"/>
+        <w:rPr>
+          <w:lang w:val="en-US"/>
+        </w:rPr>
+      </w:pPr>
+      <w:r>
+        <w:rPr>
+          <w:lang w:val="en-US"/>
+        </w:rPr>
+        <w:t>SCRIPTS_DIR     = os.path.join(BASE_DIR, "scripts")</w:t>
+      </w:r>
+    </w:p>
+    <w:p>
+      <w:pPr>
+        <w:pStyle w:val="ListParagraph"/>
+        <w:rPr>
+          <w:lang w:val="en-US"/>
+        </w:rPr>
+      </w:pPr>
+      <w:r>
+        <w:rPr>
+          <w:lang w:val="en-US"/>
+        </w:rPr>
+        <w:t>TESTS_DIR       = os.path.join(BASE_DIR, "tests")</w:t>
+      </w:r>
+    </w:p>
+    <w:p>
+      <w:pPr>
+        <w:pStyle w:val="ListParagraph"/>
+        <w:rPr>
+          <w:lang w:val="en-US"/>
+        </w:rPr>
+      </w:pPr>
+    </w:p>
+    <w:p>
+      <w:pPr>
+        <w:pStyle w:val="ListParagraph"/>
+        <w:rPr>
+          <w:lang w:val="en-US"/>
+        </w:rPr>
+      </w:pPr>
+      <w:r>
+        <w:rPr>
+          <w:lang w:val="en-US"/>
+        </w:rPr>
+        <w:t># symbols file at project root</w:t>
+      </w:r>
+    </w:p>
+    <w:p>
+      <w:pPr>
+        <w:pStyle w:val="ListParagraph"/>
+        <w:rPr>
+          <w:lang w:val="en-US"/>
+        </w:rPr>
+      </w:pPr>
+      <w:r>
+        <w:rPr>
+          <w:lang w:val="en-US"/>
+        </w:rPr>
+        <w:t>SYMBOLS_FILE    = os.path.join(BASE_DIR, "symbols.json")</w:t>
+      </w:r>
+    </w:p>
+    <w:p>
+      <w:pPr>
+        <w:pStyle w:val="ListParagraph"/>
+        <w:rPr>
+          <w:lang w:val="en-US"/>
+        </w:rPr>
+      </w:pPr>
+    </w:p>
+    <w:p>
+      <w:pPr>
+        <w:pStyle w:val="ListParagraph"/>
+        <w:rPr>
+          <w:lang w:val="en-US"/>
+        </w:rPr>
+      </w:pPr>
+      <w:r>
+        <w:rPr>
+          <w:lang w:val="en-US"/>
+        </w:rPr>
+        <w:t># ────────────────────────────────────────────────────────────────────────────────</w:t>
+      </w:r>
+    </w:p>
+    <w:p>
+      <w:pPr>
+        <w:pStyle w:val="ListParagraph"/>
+        <w:rPr>
+          <w:lang w:val="en-US"/>
+        </w:rPr>
+      </w:pPr>
+      <w:r>
+        <w:rPr>
+          <w:lang w:val="en-US"/>
+        </w:rPr>
+        <w:t># Database Files (at project root)</w:t>
+      </w:r>
+    </w:p>
+    <w:p>
+      <w:pPr>
+        <w:pStyle w:val="ListParagraph"/>
+        <w:rPr>
+          <w:lang w:val="en-US"/>
+        </w:rPr>
+      </w:pPr>
+      <w:r>
+        <w:rPr>
+          <w:lang w:val="en-US"/>
+        </w:rPr>
+        <w:t># ────────────────────────────────────────────────────────────────────────────────</w:t>
+      </w:r>
+    </w:p>
+    <w:p>
+      <w:pPr>
+        <w:pStyle w:val="ListParagraph"/>
+        <w:rPr>
+          <w:lang w:val="en-US"/>
+        </w:rPr>
+      </w:pPr>
+      <w:r>
+        <w:rPr>
+          <w:lang w:val="en-US"/>
+        </w:rPr>
+        <w:t>EXTRAS_DB_FILE    = os.path.join(BASE_DIR, "vib_extra_data.db")</w:t>
+      </w:r>
+    </w:p>
+    <w:p>
+      <w:pPr>
+        <w:pStyle w:val="ListParagraph"/>
+        <w:rPr>
+          <w:lang w:val="en-US"/>
+        </w:rPr>
+      </w:pPr>
+      <w:r>
+        <w:rPr>
+          <w:lang w:val="en-US"/>
+        </w:rPr>
+        <w:t>TRADES_DB_FILE    = os.path.join(BASE_DIR, "trades.db")</w:t>
+      </w:r>
+    </w:p>
+    <w:p>
+      <w:pPr>
+        <w:pStyle w:val="ListParagraph"/>
+        <w:rPr>
+          <w:lang w:val="en-US"/>
+        </w:rPr>
+      </w:pPr>
+      <w:r>
+        <w:rPr>
+          <w:lang w:val="en-US"/>
+        </w:rPr>
+        <w:t>ORDERBOOK_DB_FILE = os.path.join(BASE_DIR, "orderbook.db")</w:t>
+      </w:r>
+    </w:p>
+    <w:p>
+      <w:pPr>
+        <w:pStyle w:val="ListParagraph"/>
+        <w:rPr>
+          <w:lang w:val="en-US"/>
+        </w:rPr>
+      </w:pPr>
+      <w:r>
+        <w:rPr>
+          <w:lang w:val="en-US"/>
+        </w:rPr>
+        <w:t>MASTER_DB_FILE    = os.path.join(BASE_DIR, "vib_master.db")</w:t>
+      </w:r>
+    </w:p>
+    <w:p>
+      <w:pPr>
+        <w:pStyle w:val="ListParagraph"/>
+        <w:rPr>
+          <w:lang w:val="en-US"/>
+        </w:rPr>
+      </w:pPr>
+      <w:r>
+        <w:rPr>
+          <w:lang w:val="en-US"/>
+        </w:rPr>
+        <w:t>TRAINING_DB_FILE  = os.path.join(BASE_DIR, "training_data.db")</w:t>
+      </w:r>
+    </w:p>
+    <w:p>
+      <w:pPr>
+        <w:pStyle w:val="ListParagraph"/>
+        <w:rPr>
+          <w:lang w:val="en-US"/>
+        </w:rPr>
+      </w:pPr>
+      <w:r>
+        <w:rPr>
+          <w:lang w:val="en-US"/>
+        </w:rPr>
+        <w:t>METRICS_DB_FILE   = os.path.join(BASE_DIR, "metrics.db")</w:t>
+      </w:r>
+    </w:p>
+    <w:p>
+      <w:pPr>
+        <w:pStyle w:val="ListParagraph"/>
+        <w:rPr>
+          <w:lang w:val="en-US"/>
+        </w:rPr>
+      </w:pPr>
+    </w:p>
+    <w:p>
+      <w:pPr>
+        <w:pStyle w:val="ListParagraph"/>
+        <w:rPr>
+          <w:lang w:val="en-US"/>
+        </w:rPr>
+      </w:pPr>
+      <w:r>
+        <w:rPr>
+          <w:lang w:val="en-US"/>
+        </w:rPr>
+        <w:t># ────────────────────────────────────────────────────────────────────────────────</w:t>
+      </w:r>
+    </w:p>
+    <w:p>
+      <w:pPr>
+        <w:pStyle w:val="ListParagraph"/>
+        <w:rPr>
+          <w:lang w:val="en-US"/>
+        </w:rPr>
+      </w:pPr>
+      <w:r>
+        <w:rPr>
+          <w:lang w:val="en-US"/>
+        </w:rPr>
+        <w:t># ML Artifacts</w:t>
+      </w:r>
+    </w:p>
+    <w:p>
+      <w:pPr>
+        <w:pStyle w:val="ListParagraph"/>
+        <w:rPr>
+          <w:lang w:val="en-US"/>
+        </w:rPr>
+      </w:pPr>
+      <w:r>
+        <w:rPr>
+          <w:lang w:val="en-US"/>
+        </w:rPr>
+        <w:t># ────────────────────────────────────────────────────────────────────────────────</w:t>
+      </w:r>
+    </w:p>
+    <w:p>
+      <w:pPr>
+        <w:pStyle w:val="ListParagraph"/>
+        <w:rPr>
+          <w:lang w:val="en-US"/>
+        </w:rPr>
+      </w:pPr>
+      <w:r>
+        <w:rPr>
+          <w:lang w:val="en-US"/>
+        </w:rPr>
+        <w:t>MODEL_PATH_LINEAR   = os.path.join(MODELS_DIR, "model.pkl")</w:t>
+      </w:r>
+    </w:p>
+    <w:p>
+      <w:pPr>
+        <w:pStyle w:val="ListParagraph"/>
+        <w:rPr>
+          <w:lang w:val="en-US"/>
+        </w:rPr>
+      </w:pPr>
+      <w:r>
+        <w:rPr>
+          <w:lang w:val="en-US"/>
+        </w:rPr>
+        <w:t>SCALER_PATH_LINEAR  = os.path.join(MODELS_DIR, "scaler_linear.pkl")</w:t>
+      </w:r>
+    </w:p>
+    <w:p>
+      <w:pPr>
+        <w:pStyle w:val="ListParagraph"/>
+        <w:rPr>
+          <w:lang w:val="en-US"/>
+        </w:rPr>
+      </w:pPr>
+      <w:r>
+        <w:rPr>
+          <w:lang w:val="en-US"/>
+        </w:rPr>
+        <w:t>MODEL_PATH_NN       = os.path.join(MODELS_DIR, "model_nn.keras")</w:t>
+      </w:r>
+    </w:p>
+    <w:p>
+      <w:pPr>
+        <w:pStyle w:val="ListParagraph"/>
+        <w:rPr>
+          <w:lang w:val="en-US"/>
+        </w:rPr>
+      </w:pPr>
+      <w:r>
+        <w:rPr>
+          <w:lang w:val="en-US"/>
+        </w:rPr>
+        <w:t>SCALER_PATH_NN      = os.path.join(MODELS_DIR, "scaler_nn.pkl")</w:t>
+      </w:r>
+    </w:p>
+    <w:p>
+      <w:pPr>
+        <w:pStyle w:val="ListParagraph"/>
+        <w:rPr>
+          <w:lang w:val="en-US"/>
+        </w:rPr>
+      </w:pPr>
+      <w:r>
+        <w:rPr>
+          <w:lang w:val="en-US"/>
+        </w:rPr>
+        <w:t>ACTIVE_MODEL_FILE   = os.path.join(MODELS_DIR, "active_model.txt")</w:t>
+      </w:r>
+    </w:p>
+    <w:p>
+      <w:pPr>
+        <w:pStyle w:val="ListParagraph"/>
+        <w:rPr>
+          <w:lang w:val="en-US"/>
+        </w:rPr>
+      </w:pPr>
+    </w:p>
+    <w:p>
+      <w:pPr>
+        <w:pStyle w:val="ListParagraph"/>
+        <w:rPr>
+          <w:lang w:val="en-US"/>
+        </w:rPr>
+      </w:pPr>
+      <w:r>
+        <w:rPr>
+          <w:lang w:val="en-US"/>
+        </w:rPr>
+        <w:t># ────────────────────────────────────────────────────────────────────────────────</w:t>
+      </w:r>
+    </w:p>
+    <w:p>
+      <w:pPr>
+        <w:pStyle w:val="ListParagraph"/>
+        <w:rPr>
+          <w:lang w:val="en-US"/>
+        </w:rPr>
+      </w:pPr>
+      <w:r>
+        <w:rPr>
+          <w:lang w:val="en-US"/>
+        </w:rPr>
+        <w:t># Telegram / Notification</w:t>
+      </w:r>
+    </w:p>
+    <w:p>
+      <w:pPr>
+        <w:pStyle w:val="ListParagraph"/>
+        <w:rPr>
+          <w:lang w:val="en-US"/>
+        </w:rPr>
+      </w:pPr>
+      <w:r>
+        <w:rPr>
+          <w:lang w:val="en-US"/>
+        </w:rPr>
+        <w:t># ────────────────────────────────────────────────────────────────────────────────</w:t>
+      </w:r>
+    </w:p>
+    <w:p>
+      <w:pPr>
+        <w:pStyle w:val="ListParagraph"/>
+        <w:rPr>
+          <w:lang w:val="en-US"/>
+        </w:rPr>
+      </w:pPr>
+      <w:r>
+        <w:rPr>
+          <w:lang w:val="en-US"/>
+        </w:rPr>
+        <w:t>TELEGRAM_TOKEN      = os.getenv("VIB_BOT_TELEGRAM_TOKEN", "")</w:t>
+      </w:r>
+    </w:p>
+    <w:p>
+      <w:pPr>
+        <w:pStyle w:val="ListParagraph"/>
+        <w:rPr>
+          <w:lang w:val="en-US"/>
+        </w:rPr>
+      </w:pPr>
+      <w:r>
+        <w:rPr>
+          <w:lang w:val="en-US"/>
+        </w:rPr>
+        <w:t>CHAT_ID             = int(os.getenv("VIB_BOT_CHAT_ID", "123456789"))</w:t>
+      </w:r>
+    </w:p>
+    <w:p>
+      <w:pPr>
+        <w:pStyle w:val="ListParagraph"/>
+        <w:rPr>
+          <w:lang w:val="en-US"/>
+        </w:rPr>
+      </w:pPr>
+    </w:p>
+    <w:p>
+      <w:pPr>
+        <w:pStyle w:val="ListParagraph"/>
+        <w:rPr>
+          <w:lang w:val="en-US"/>
+        </w:rPr>
+      </w:pPr>
+      <w:r>
+        <w:rPr>
+          <w:lang w:val="en-US"/>
+        </w:rPr>
+        <w:t># ────────────────────────────────────────────────────────────────────────────────</w:t>
+      </w:r>
+    </w:p>
+    <w:p>
+      <w:pPr>
+        <w:pStyle w:val="ListParagraph"/>
+        <w:rPr>
+          <w:lang w:val="en-US"/>
+        </w:rPr>
+      </w:pPr>
+      <w:r>
+        <w:rPr>
+          <w:lang w:val="en-US"/>
+        </w:rPr>
+        <w:t># Parameters: thresholds, windows &amp; risk sizing</w:t>
+      </w:r>
+    </w:p>
+    <w:p>
+      <w:pPr>
+        <w:pStyle w:val="ListParagraph"/>
+        <w:rPr>
+          <w:lang w:val="en-US"/>
+        </w:rPr>
+      </w:pPr>
+      <w:r>
+        <w:rPr>
+          <w:lang w:val="en-US"/>
+        </w:rPr>
+        <w:t># ────────────────────────────────────────────────────────────────────────────────</w:t>
+      </w:r>
+    </w:p>
+    <w:p>
+      <w:pPr>
+        <w:pStyle w:val="ListParagraph"/>
+        <w:rPr>
+          <w:lang w:val="en-US"/>
+        </w:rPr>
+      </w:pPr>
+      <w:r>
+        <w:rPr>
+          <w:lang w:val="en-US"/>
+        </w:rPr>
+        <w:t>BIG_TRADE_THRESHOLD      = int(os.getenv("VIB_BOT_BIG_TRADE_THRESHOLD", "100000"))</w:t>
+      </w:r>
+    </w:p>
+    <w:p>
+      <w:pPr>
+        <w:pStyle w:val="ListParagraph"/>
+        <w:rPr>
+          <w:lang w:val="en-US"/>
+        </w:rPr>
+      </w:pPr>
+      <w:r>
+        <w:rPr>
+          <w:lang w:val="en-US"/>
+        </w:rPr>
+        <w:t>DATA_FRESHNESS_THRESHOLD = int(os.getenv("VIB_BOT_DATA_FRESHNESS_THRESHOLD", "120"))</w:t>
+      </w:r>
+    </w:p>
+    <w:p>
+      <w:pPr>
+        <w:pStyle w:val="ListParagraph"/>
+        <w:rPr>
+          <w:lang w:val="en-US"/>
+        </w:rPr>
+      </w:pPr>
+      <w:r>
+        <w:rPr>
+          <w:lang w:val="en-US"/>
+        </w:rPr>
+        <w:t>FEEDBACK_WINDOW          = int(os.getenv("VIB_BOT_FEEDBACK_WINDOW", "3600"))</w:t>
+      </w:r>
+    </w:p>
+    <w:p>
+      <w:pPr>
+        <w:pStyle w:val="ListParagraph"/>
+        <w:rPr>
+          <w:lang w:val="en-US"/>
+        </w:rPr>
+      </w:pPr>
+      <w:r>
+        <w:rPr>
+          <w:lang w:val="en-US"/>
+        </w:rPr>
+        <w:t>LOOK_AHEAD               = int(os.getenv("VIB_BOT_LOOK_AHEAD", "5"))</w:t>
+      </w:r>
+    </w:p>
+    <w:p>
+      <w:pPr>
+        <w:pStyle w:val="ListParagraph"/>
+        <w:rPr>
+          <w:lang w:val="en-US"/>
+        </w:rPr>
+      </w:pPr>
+      <w:r>
+        <w:rPr>
+          <w:lang w:val="en-US"/>
+        </w:rPr>
+        <w:t>INFERENCE_INTERVAL       = int(os.getenv("VIB_BOT_INFERENCE_INTERVAL", "30"))</w:t>
+      </w:r>
+    </w:p>
+    <w:p>
+      <w:pPr>
+        <w:pStyle w:val="ListParagraph"/>
+        <w:rPr>
+          <w:lang w:val="en-US"/>
+        </w:rPr>
+      </w:pPr>
+    </w:p>
+    <w:p>
+      <w:pPr>
+        <w:pStyle w:val="ListParagraph"/>
+        <w:rPr>
+          <w:lang w:val="en-US"/>
+        </w:rPr>
+      </w:pPr>
+      <w:r>
+        <w:rPr>
+          <w:lang w:val="en-US"/>
+        </w:rPr>
+        <w:t># Backtest realism</w:t>
+      </w:r>
+    </w:p>
+    <w:p>
+      <w:pPr>
+        <w:pStyle w:val="ListParagraph"/>
+        <w:rPr>
+          <w:lang w:val="en-US"/>
+        </w:rPr>
+      </w:pPr>
+      <w:r>
+        <w:rPr>
+          <w:lang w:val="en-US"/>
+        </w:rPr>
+        <w:t>BACKTEST_SLIPPAGE_PCT    = float(os.getenv("VIB_BOT_BACKTEST_SLIPPAGE_PCT", "0.0005"))</w:t>
+      </w:r>
+    </w:p>
+    <w:p>
+      <w:pPr>
+        <w:pStyle w:val="ListParagraph"/>
+        <w:rPr>
+          <w:lang w:val="en-US"/>
+        </w:rPr>
+      </w:pPr>
+      <w:r>
+        <w:rPr>
+          <w:lang w:val="en-US"/>
+        </w:rPr>
+        <w:t>BACKTEST_FEES_PCT        = float(os.getenv("VIB_BOT_BACKTEST_FEES_PCT", "0.001"))</w:t>
+      </w:r>
+    </w:p>
+    <w:p>
+      <w:pPr>
+        <w:pStyle w:val="ListParagraph"/>
+        <w:rPr>
+          <w:lang w:val="en-US"/>
+        </w:rPr>
+      </w:pPr>
+    </w:p>
+    <w:p>
+      <w:pPr>
+        <w:pStyle w:val="ListParagraph"/>
+        <w:rPr>
+          <w:lang w:val="en-US"/>
+        </w:rPr>
+      </w:pPr>
+      <w:r>
+        <w:rPr>
+          <w:lang w:val="en-US"/>
+        </w:rPr>
+        <w:t># Execution</w:t>
       </w:r>
       <w:r>
         <w:rPr>
@@ -24366,8 +25422,114 @@
         <w:rPr>
           <w:lang w:val="en-US"/>
         </w:rPr>
-        <w:t>folder Paths</w:t>
-      </w:r>
+        <w:t>Engine / Risk &amp; Sizing</w:t>
+      </w:r>
+    </w:p>
+    <w:p>
+      <w:pPr>
+        <w:pStyle w:val="ListParagraph"/>
+        <w:rPr>
+          <w:lang w:val="en-US"/>
+        </w:rPr>
+      </w:pPr>
+      <w:r>
+        <w:rPr>
+          <w:lang w:val="en-US"/>
+        </w:rPr>
+        <w:t>RISK_PER_TRADE           = float(os.getenv("VIB_BOT_RISK_PER_TRADE", "0.005"))</w:t>
+      </w:r>
+    </w:p>
+    <w:p>
+      <w:pPr>
+        <w:pStyle w:val="ListParagraph"/>
+        <w:rPr>
+          <w:lang w:val="en-US"/>
+        </w:rPr>
+      </w:pPr>
+      <w:r>
+        <w:rPr>
+          <w:lang w:val="en-US"/>
+        </w:rPr>
+        <w:t>STOP_LOSS_PCT            = float(os.getenv("VIB_BOT_STOP_LOSS_PCT", "0.012"))</w:t>
+      </w:r>
+    </w:p>
+    <w:p>
+      <w:pPr>
+        <w:pStyle w:val="ListParagraph"/>
+        <w:rPr>
+          <w:lang w:val="en-US"/>
+        </w:rPr>
+      </w:pPr>
+      <w:r>
+        <w:rPr>
+          <w:lang w:val="en-US"/>
+        </w:rPr>
+        <w:t>TAKE_PROFIT_PCT          = float(os.getenv("VIB_BOT_TAKE_PROFIT_PCT", "0.018"))</w:t>
+      </w:r>
+    </w:p>
+    <w:p>
+      <w:pPr>
+        <w:pStyle w:val="ListParagraph"/>
+        <w:rPr>
+          <w:lang w:val="en-US"/>
+        </w:rPr>
+      </w:pPr>
+      <w:r>
+        <w:rPr>
+          <w:lang w:val="en-US"/>
+        </w:rPr>
+        <w:t>SLIPPAGE_TOLERANCE       = float(os.getenv("VIB_BOT_SLIPPAGE_TOLERANCE", "0.001"))</w:t>
+      </w:r>
+    </w:p>
+    <w:p>
+      <w:pPr>
+        <w:pStyle w:val="ListParagraph"/>
+        <w:rPr>
+          <w:lang w:val="en-US"/>
+        </w:rPr>
+      </w:pPr>
+      <w:r>
+        <w:rPr>
+          <w:lang w:val="en-US"/>
+        </w:rPr>
+        <w:t>MAX_PORTFOLIO_DRAWDOWN   = float(os.getenv("VIB_BOT_MAX_DRAWDOWN", "0.20"))</w:t>
+      </w:r>
+    </w:p>
+    <w:p>
+      <w:pPr>
+        <w:pStyle w:val="ListParagraph"/>
+        <w:rPr>
+          <w:lang w:val="en-US"/>
+        </w:rPr>
+      </w:pPr>
+      <w:r>
+        <w:rPr>
+          <w:lang w:val="en-US"/>
+        </w:rPr>
+        <w:t>COOLDOWN_HOURS           = int(os.getenv("VIB_BOT_COOLDOWN_HOURS", "2"))</w:t>
+      </w:r>
+    </w:p>
+    <w:p>
+      <w:pPr>
+        <w:pStyle w:val="ListParagraph"/>
+        <w:rPr>
+          <w:lang w:val="en-US"/>
+        </w:rPr>
+      </w:pPr>
+      <w:r>
+        <w:rPr>
+          <w:lang w:val="en-US"/>
+        </w:rPr>
+        <w:t>MAX_DAILY_DRAWDOWN       = float(os.getenv("VIB_BOT_MAX_DAILY_DRAWDOWN", "0.05"))</w:t>
+      </w:r>
+    </w:p>
+    <w:p>
+      <w:pPr>
+        <w:pStyle w:val="ListParagraph"/>
+        <w:rPr>
+          <w:lang w:val="en-US"/>
+        </w:rPr>
+      </w:pPr>
     </w:p>
     <w:p>
       <w:pPr>
@@ -24394,128 +25556,8 @@
         <w:rPr>
           <w:lang w:val="en-US"/>
         </w:rPr>
-        <w:t>BASE_DIR         = os.getenv("VIB_BOT_BASE_DIR", os.path.expanduser("~/Documents/vib_bot"))</w:t>
-      </w:r>
-    </w:p>
-    <w:p>
-      <w:pPr>
-        <w:pStyle w:val="ListParagraph"/>
-        <w:rPr>
-          <w:lang w:val="en-US"/>
-        </w:rPr>
-      </w:pPr>
-      <w:r>
-        <w:rPr>
-          <w:lang w:val="en-US"/>
-        </w:rPr>
-        <w:t>DATA_DIR         = os.path.join(BASE_DIR, "data")</w:t>
-      </w:r>
-    </w:p>
-    <w:p>
-      <w:pPr>
-        <w:pStyle w:val="ListParagraph"/>
-        <w:rPr>
-          <w:lang w:val="en-US"/>
-        </w:rPr>
-      </w:pPr>
-      <w:r>
-        <w:rPr>
-          <w:lang w:val="en-US"/>
-        </w:rPr>
-        <w:t>PROCESSING_DIR   = os.path.join(BASE_DIR, "processing")</w:t>
-      </w:r>
-    </w:p>
-    <w:p>
-      <w:pPr>
-        <w:pStyle w:val="ListParagraph"/>
-        <w:rPr>
-          <w:lang w:val="en-US"/>
-        </w:rPr>
-      </w:pPr>
-      <w:r>
-        <w:rPr>
-          <w:lang w:val="en-US"/>
-        </w:rPr>
-        <w:t>MODELS_DIR       = os.path.join(BASE_DIR, "models")</w:t>
-      </w:r>
-    </w:p>
-    <w:p>
-      <w:pPr>
-        <w:pStyle w:val="ListParagraph"/>
-        <w:rPr>
-          <w:lang w:val="en-US"/>
-        </w:rPr>
-      </w:pPr>
-      <w:r>
-        <w:rPr>
-          <w:lang w:val="en-US"/>
-        </w:rPr>
-        <w:t>REALTIME_DIR     = os.path.join(BASE_DIR, "realtime")</w:t>
-      </w:r>
-    </w:p>
-    <w:p>
-      <w:pPr>
-        <w:pStyle w:val="ListParagraph"/>
-        <w:rPr>
-          <w:lang w:val="en-US"/>
-        </w:rPr>
-      </w:pPr>
-      <w:r>
-        <w:rPr>
-          <w:lang w:val="en-US"/>
-        </w:rPr>
-        <w:t>BACKTEST_DIR     = os.path.join(BASE_DIR, "backtest")</w:t>
-      </w:r>
-    </w:p>
-    <w:p>
-      <w:pPr>
-        <w:pStyle w:val="ListParagraph"/>
-        <w:rPr>
-          <w:lang w:val="en-US"/>
-        </w:rPr>
-      </w:pPr>
-      <w:r>
-        <w:rPr>
-          <w:lang w:val="en-US"/>
-        </w:rPr>
-        <w:t>MONITORING_DIR   = os.path.join(BASE_DIR, "monitoring")</w:t>
-      </w:r>
-    </w:p>
-    <w:p>
-      <w:pPr>
-        <w:pStyle w:val="ListParagraph"/>
-        <w:rPr>
-          <w:lang w:val="en-US"/>
-        </w:rPr>
-      </w:pPr>
-      <w:r>
-        <w:rPr>
-          <w:lang w:val="en-US"/>
-        </w:rPr>
-        <w:t>SCRIPTS_DIR      = os.path.join(BASE_DIR, "scripts")</w:t>
-      </w:r>
-    </w:p>
-    <w:p>
-      <w:pPr>
-        <w:pStyle w:val="ListParagraph"/>
-        <w:rPr>
-          <w:lang w:val="en-US"/>
-        </w:rPr>
-      </w:pPr>
-      <w:r>
-        <w:rPr>
-          <w:lang w:val="en-US"/>
-        </w:rPr>
-        <w:t>TESTS_DIR        = os.path.join(BASE_DIR, "tests")</w:t>
-      </w:r>
-    </w:p>
-    <w:p>
-      <w:pPr>
-        <w:pStyle w:val="ListParagraph"/>
-        <w:rPr>
-          <w:lang w:val="en-US"/>
-        </w:rPr>
-      </w:pPr>
+        <w:t># Trading universe</w:t>
+      </w:r>
     </w:p>
     <w:p>
       <w:pPr>
@@ -24542,8 +25584,177 @@
         <w:rPr>
           <w:lang w:val="en-US"/>
         </w:rPr>
-        <w:t># Database Files (still in BASE_DIR)</w:t>
-      </w:r>
+        <w:t>_env_syms = os.getenv("VIB_BOT_SYMBOLS")</w:t>
+      </w:r>
+    </w:p>
+    <w:p>
+      <w:pPr>
+        <w:pStyle w:val="ListParagraph"/>
+        <w:rPr>
+          <w:lang w:val="en-US"/>
+        </w:rPr>
+      </w:pPr>
+      <w:r>
+        <w:rPr>
+          <w:lang w:val="en-US"/>
+        </w:rPr>
+        <w:t>if _env_syms:</w:t>
+      </w:r>
+    </w:p>
+    <w:p>
+      <w:pPr>
+        <w:pStyle w:val="ListParagraph"/>
+        <w:rPr>
+          <w:lang w:val="en-US"/>
+        </w:rPr>
+      </w:pPr>
+      <w:r>
+        <w:rPr>
+          <w:lang w:val="en-US"/>
+        </w:rPr>
+        <w:t xml:space="preserve">    SYMBOLS = _env_syms.split(",")</w:t>
+      </w:r>
+    </w:p>
+    <w:p>
+      <w:pPr>
+        <w:pStyle w:val="ListParagraph"/>
+        <w:rPr>
+          <w:lang w:val="en-US"/>
+        </w:rPr>
+      </w:pPr>
+      <w:r>
+        <w:rPr>
+          <w:lang w:val="en-US"/>
+        </w:rPr>
+        <w:t>else:</w:t>
+      </w:r>
+    </w:p>
+    <w:p>
+      <w:pPr>
+        <w:pStyle w:val="ListParagraph"/>
+        <w:rPr>
+          <w:lang w:val="en-US"/>
+        </w:rPr>
+      </w:pPr>
+      <w:r>
+        <w:rPr>
+          <w:lang w:val="en-US"/>
+        </w:rPr>
+        <w:t xml:space="preserve">    try:</w:t>
+      </w:r>
+    </w:p>
+    <w:p>
+      <w:pPr>
+        <w:pStyle w:val="ListParagraph"/>
+        <w:rPr>
+          <w:lang w:val="en-US"/>
+        </w:rPr>
+      </w:pPr>
+      <w:r>
+        <w:rPr>
+          <w:lang w:val="en-US"/>
+        </w:rPr>
+        <w:t xml:space="preserve">        with open(SYMBOLS_FILE) as f:</w:t>
+      </w:r>
+    </w:p>
+    <w:p>
+      <w:pPr>
+        <w:pStyle w:val="ListParagraph"/>
+        <w:rPr>
+          <w:lang w:val="en-US"/>
+        </w:rPr>
+      </w:pPr>
+      <w:r>
+        <w:rPr>
+          <w:lang w:val="en-US"/>
+        </w:rPr>
+        <w:t xml:space="preserve">            SYMBOLS = json.load(f)</w:t>
+      </w:r>
+    </w:p>
+    <w:p>
+      <w:pPr>
+        <w:pStyle w:val="ListParagraph"/>
+        <w:rPr>
+          <w:lang w:val="en-US"/>
+        </w:rPr>
+      </w:pPr>
+      <w:r>
+        <w:rPr>
+          <w:lang w:val="en-US"/>
+        </w:rPr>
+        <w:t xml:space="preserve">    except Exception:</w:t>
+      </w:r>
+    </w:p>
+    <w:p>
+      <w:pPr>
+        <w:pStyle w:val="ListParagraph"/>
+        <w:rPr>
+          <w:lang w:val="en-US"/>
+        </w:rPr>
+      </w:pPr>
+      <w:r>
+        <w:rPr>
+          <w:lang w:val="en-US"/>
+        </w:rPr>
+        <w:t xml:space="preserve">        SYMBOLS = ["VIBUSDT", "BTCUSDT", "ETHUSDT", "BNBUSDT"]</w:t>
+      </w:r>
+    </w:p>
+    <w:p>
+      <w:pPr>
+        <w:pStyle w:val="ListParagraph"/>
+        <w:rPr>
+          <w:lang w:val="en-US"/>
+        </w:rPr>
+      </w:pPr>
+    </w:p>
+    <w:p>
+      <w:pPr>
+        <w:pStyle w:val="ListParagraph"/>
+        <w:rPr>
+          <w:lang w:val="en-US"/>
+        </w:rPr>
+      </w:pPr>
+      <w:r>
+        <w:rPr>
+          <w:lang w:val="en-US"/>
+        </w:rPr>
+        <w:t># Re</w:t>
+      </w:r>
+      <w:r>
+        <w:rPr>
+          <w:rFonts w:ascii="Cambria Math" w:hAnsi="Cambria Math" w:cs="Cambria Math"/>
+          <w:lang w:val="en-US"/>
+        </w:rPr>
+        <w:t>‐</w:t>
+      </w:r>
+      <w:r>
+        <w:rPr>
+          <w:lang w:val="en-US"/>
+        </w:rPr>
+        <w:t>use SYMBOLS for correlation diffs</w:t>
+      </w:r>
+    </w:p>
+    <w:p>
+      <w:pPr>
+        <w:pStyle w:val="ListParagraph"/>
+        <w:rPr>
+          <w:lang w:val="en-US"/>
+        </w:rPr>
+      </w:pPr>
+      <w:r>
+        <w:rPr>
+          <w:lang w:val="en-US"/>
+        </w:rPr>
+        <w:t>CORRELATION_SYMBOLS = SYMBOLS</w:t>
+      </w:r>
+    </w:p>
+    <w:p>
+      <w:pPr>
+        <w:pStyle w:val="ListParagraph"/>
+        <w:rPr>
+          <w:lang w:val="en-US"/>
+        </w:rPr>
+      </w:pPr>
     </w:p>
     <w:p>
       <w:pPr>
@@ -24570,86 +25781,8 @@
         <w:rPr>
           <w:lang w:val="en-US"/>
         </w:rPr>
-        <w:t>EXTRAS_DB_FILE        = os.path.join(BASE_DIR, "vib_extra_data.db")</w:t>
-      </w:r>
-    </w:p>
-    <w:p>
-      <w:pPr>
-        <w:pStyle w:val="ListParagraph"/>
-        <w:rPr>
-          <w:lang w:val="en-US"/>
-        </w:rPr>
-      </w:pPr>
-      <w:r>
-        <w:rPr>
-          <w:lang w:val="en-US"/>
-        </w:rPr>
-        <w:t>TRADES_DB_FILE        = os.path.join(BASE_DIR, "trades.db")</w:t>
-      </w:r>
-    </w:p>
-    <w:p>
-      <w:pPr>
-        <w:pStyle w:val="ListParagraph"/>
-        <w:rPr>
-          <w:lang w:val="en-US"/>
-        </w:rPr>
-      </w:pPr>
-      <w:r>
-        <w:rPr>
-          <w:lang w:val="en-US"/>
-        </w:rPr>
-        <w:t>ORDERBOOK_DB_FILE     = os.path.join(BASE_DIR, "orderbook.db")</w:t>
-      </w:r>
-    </w:p>
-    <w:p>
-      <w:pPr>
-        <w:pStyle w:val="ListParagraph"/>
-        <w:rPr>
-          <w:lang w:val="en-US"/>
-        </w:rPr>
-      </w:pPr>
-      <w:r>
-        <w:rPr>
-          <w:lang w:val="en-US"/>
-        </w:rPr>
-        <w:t>MASTER_DB_FILE        = os.path.join(BASE_DIR, "vib_master.db")</w:t>
-      </w:r>
-    </w:p>
-    <w:p>
-      <w:pPr>
-        <w:pStyle w:val="ListParagraph"/>
-        <w:rPr>
-          <w:lang w:val="en-US"/>
-        </w:rPr>
-      </w:pPr>
-      <w:r>
-        <w:rPr>
-          <w:lang w:val="en-US"/>
-        </w:rPr>
-        <w:t>TRAINING_DB_FILE      = os.path.join(BASE_DIR, "training_data.db")</w:t>
-      </w:r>
-    </w:p>
-    <w:p>
-      <w:pPr>
-        <w:pStyle w:val="ListParagraph"/>
-        <w:rPr>
-          <w:lang w:val="en-US"/>
-        </w:rPr>
-      </w:pPr>
-      <w:r>
-        <w:rPr>
-          <w:lang w:val="en-US"/>
-        </w:rPr>
-        <w:t>METRICS_DB_FILE       = os.path.join(BASE_DIR, "metrics.db")</w:t>
-      </w:r>
-    </w:p>
-    <w:p>
-      <w:pPr>
-        <w:pStyle w:val="ListParagraph"/>
-        <w:rPr>
-          <w:lang w:val="en-US"/>
-        </w:rPr>
-      </w:pPr>
+        <w:t># Exchange / API credentials</w:t>
+      </w:r>
     </w:p>
     <w:p>
       <w:pPr>
@@ -24676,8 +25809,30 @@
         <w:rPr>
           <w:lang w:val="en-US"/>
         </w:rPr>
-        <w:t># ML Artifacts</w:t>
-      </w:r>
+        <w:t>EXCHANGE_API_KEY      = os.getenv("EXCHANGE_API_KEY", "")</w:t>
+      </w:r>
+    </w:p>
+    <w:p>
+      <w:pPr>
+        <w:pStyle w:val="ListParagraph"/>
+        <w:rPr>
+          <w:lang w:val="en-US"/>
+        </w:rPr>
+      </w:pPr>
+      <w:r>
+        <w:rPr>
+          <w:lang w:val="en-US"/>
+        </w:rPr>
+        <w:t>EXCHANGE_API_SECRET   = os.getenv("EXCHANGE_API_SECRET", "")</w:t>
+      </w:r>
+    </w:p>
+    <w:p>
+      <w:pPr>
+        <w:pStyle w:val="ListParagraph"/>
+        <w:rPr>
+          <w:lang w:val="en-US"/>
+        </w:rPr>
+      </w:pPr>
     </w:p>
     <w:p>
       <w:pPr>
@@ -24704,72 +25859,8 @@
         <w:rPr>
           <w:lang w:val="en-US"/>
         </w:rPr>
-        <w:t>MODEL_PATH_LINEAR     = os.path.join(MODELS_DIR, "model.pkl")</w:t>
-      </w:r>
-    </w:p>
-    <w:p>
-      <w:pPr>
-        <w:pStyle w:val="ListParagraph"/>
-        <w:rPr>
-          <w:lang w:val="en-US"/>
-        </w:rPr>
-      </w:pPr>
-      <w:r>
-        <w:rPr>
-          <w:lang w:val="en-US"/>
-        </w:rPr>
-        <w:t>SCALER_PATH_LINEAR    = os.path.join(MODELS_DIR, "scaler_linear.pkl")</w:t>
-      </w:r>
-    </w:p>
-    <w:p>
-      <w:pPr>
-        <w:pStyle w:val="ListParagraph"/>
-        <w:rPr>
-          <w:lang w:val="en-US"/>
-        </w:rPr>
-      </w:pPr>
-      <w:r>
-        <w:rPr>
-          <w:lang w:val="en-US"/>
-        </w:rPr>
-        <w:t>MODEL_PATH_NN         = os.path.join(MODELS_DIR, "model_nn.keras")</w:t>
-      </w:r>
-    </w:p>
-    <w:p>
-      <w:pPr>
-        <w:pStyle w:val="ListParagraph"/>
-        <w:rPr>
-          <w:lang w:val="en-US"/>
-        </w:rPr>
-      </w:pPr>
-      <w:r>
-        <w:rPr>
-          <w:lang w:val="en-US"/>
-        </w:rPr>
-        <w:t>SCALER_PATH_NN        = os.path.join(MODELS_DIR, "scaler_nn.pkl")</w:t>
-      </w:r>
-    </w:p>
-    <w:p>
-      <w:pPr>
-        <w:pStyle w:val="ListParagraph"/>
-        <w:rPr>
-          <w:lang w:val="en-US"/>
-        </w:rPr>
-      </w:pPr>
-      <w:r>
-        <w:rPr>
-          <w:lang w:val="en-US"/>
-        </w:rPr>
-        <w:t>ACTIVE_MODEL_FILE     = os.path.join(MODELS_DIR, "active_model.txt")</w:t>
-      </w:r>
-    </w:p>
-    <w:p>
-      <w:pPr>
-        <w:pStyle w:val="ListParagraph"/>
-        <w:rPr>
-          <w:lang w:val="en-US"/>
-        </w:rPr>
-      </w:pPr>
+        <w:t># Monitoring</w:t>
+      </w:r>
     </w:p>
     <w:p>
       <w:pPr>
@@ -24796,1395 +25887,16 @@
         <w:rPr>
           <w:lang w:val="en-US"/>
         </w:rPr>
-        <w:t># Script Locations (for master.py orchestration)</w:t>
-      </w:r>
-    </w:p>
-    <w:p>
-      <w:pPr>
-        <w:pStyle w:val="ListParagraph"/>
-        <w:rPr>
-          <w:lang w:val="en-US"/>
-        </w:rPr>
-      </w:pPr>
-      <w:r>
-        <w:rPr>
-          <w:lang w:val="en-US"/>
-        </w:rPr>
-        <w:t># ────────────────────────────────────────────────────────────────────────────────</w:t>
-      </w:r>
-    </w:p>
-    <w:p>
-      <w:pPr>
-        <w:pStyle w:val="ListParagraph"/>
-        <w:rPr>
-          <w:lang w:val="en-US"/>
-        </w:rPr>
-      </w:pPr>
-      <w:r>
-        <w:rPr>
-          <w:lang w:val="en-US"/>
-        </w:rPr>
-        <w:t>GENERATE_SCRIPT       = os.path.join(PROCESSING_DIR, "generate_training_data.py")</w:t>
-      </w:r>
-    </w:p>
-    <w:p>
-      <w:pPr>
-        <w:pStyle w:val="ListParagraph"/>
-        <w:rPr>
-          <w:lang w:val="en-US"/>
-        </w:rPr>
-      </w:pPr>
-      <w:r>
-        <w:rPr>
-          <w:lang w:val="en-US"/>
-        </w:rPr>
-        <w:t>TRAINER_LINEAR        = os.path.join(MODELS_DIR, "train_model_linear.py")</w:t>
-      </w:r>
-    </w:p>
-    <w:p>
-      <w:pPr>
-        <w:pStyle w:val="ListParagraph"/>
-        <w:rPr>
-          <w:lang w:val="en-US"/>
-        </w:rPr>
-      </w:pPr>
-      <w:r>
-        <w:rPr>
-          <w:lang w:val="en-US"/>
-        </w:rPr>
-        <w:t>TRAINER_NN            = os.path.join(MODELS_DIR, "train_model_nn.py")</w:t>
-      </w:r>
-    </w:p>
-    <w:p>
-      <w:pPr>
-        <w:pStyle w:val="ListParagraph"/>
-        <w:rPr>
-          <w:lang w:val="en-US"/>
-        </w:rPr>
-      </w:pPr>
-      <w:r>
-        <w:rPr>
-          <w:lang w:val="en-US"/>
-        </w:rPr>
-        <w:t>EVAL_SWITCH_SCRIPT    = os.path.join(MODELS_DIR, "evaluate_and_switch.py")</w:t>
-      </w:r>
-    </w:p>
-    <w:p>
-      <w:pPr>
-        <w:pStyle w:val="ListParagraph"/>
-        <w:rPr>
-          <w:lang w:val="en-US"/>
-        </w:rPr>
-      </w:pPr>
-      <w:r>
-        <w:rPr>
-          <w:lang w:val="en-US"/>
-        </w:rPr>
-        <w:t>ONLINE_UPDATER_SCRIPT = os.path.join(MODELS_DIR, "train_model_online</w:t>
-      </w:r>
-      <w:r>
-        <w:rPr>
-          <w:lang w:val="en-US"/>
-        </w:rPr>
-        <w:t>_enhanced</w:t>
-      </w:r>
-      <w:r>
-        <w:rPr>
-          <w:lang w:val="en-US"/>
-        </w:rPr>
-        <w:t>.py")</w:t>
-      </w:r>
-    </w:p>
-    <w:p>
-      <w:pPr>
-        <w:pStyle w:val="ListParagraph"/>
-        <w:rPr>
-          <w:lang w:val="en-US"/>
-        </w:rPr>
-      </w:pPr>
-    </w:p>
-    <w:p>
-      <w:pPr>
-        <w:pStyle w:val="ListParagraph"/>
-        <w:rPr>
-          <w:lang w:val="en-US"/>
-        </w:rPr>
-      </w:pPr>
-      <w:r>
-        <w:rPr>
-          <w:lang w:val="en-US"/>
-        </w:rPr>
-        <w:t># ────────────────────────────────────────────────────────────────────────────────</w:t>
-      </w:r>
-    </w:p>
-    <w:p>
-      <w:pPr>
-        <w:pStyle w:val="ListParagraph"/>
-        <w:rPr>
-          <w:lang w:val="en-US"/>
-        </w:rPr>
-      </w:pPr>
-      <w:r>
-        <w:rPr>
-          <w:lang w:val="en-US"/>
-        </w:rPr>
-        <w:t># Live</w:t>
-      </w:r>
-      <w:r>
-        <w:rPr>
-          <w:rFonts w:ascii="Cambria Math" w:hAnsi="Cambria Math" w:cs="Cambria Math"/>
-          <w:lang w:val="en-US"/>
-        </w:rPr>
-        <w:t>‐</w:t>
-      </w:r>
-      <w:r>
-        <w:rPr>
-          <w:lang w:val="en-US"/>
-        </w:rPr>
-        <w:t>feed &amp; realtime files</w:t>
-      </w:r>
-    </w:p>
-    <w:p>
-      <w:pPr>
-        <w:pStyle w:val="ListParagraph"/>
-        <w:rPr>
-          <w:lang w:val="en-US"/>
-        </w:rPr>
-      </w:pPr>
-      <w:r>
-        <w:rPr>
-          <w:lang w:val="en-US"/>
-        </w:rPr>
-        <w:t># ────────────────────────────────────────────────────────────────────────────────</w:t>
-      </w:r>
-    </w:p>
-    <w:p>
-      <w:pPr>
-        <w:pStyle w:val="ListParagraph"/>
-        <w:rPr>
-          <w:lang w:val="en-US"/>
-        </w:rPr>
-      </w:pPr>
-      <w:r>
-        <w:rPr>
-          <w:lang w:val="en-US"/>
-        </w:rPr>
-        <w:t>VIB_EXTRAS_SCRIPT     = os.path.join(DATA_DIR, "vib_extras.py")</w:t>
-      </w:r>
-    </w:p>
-    <w:p>
-      <w:pPr>
-        <w:pStyle w:val="ListParagraph"/>
-        <w:rPr>
-          <w:lang w:val="en-US"/>
-        </w:rPr>
-      </w:pPr>
-      <w:r>
-        <w:rPr>
-          <w:lang w:val="en-US"/>
-        </w:rPr>
-        <w:t>VIB_ALERT_SCRIPT      = os.path.join(DATA_DIR, "vib_alert.py")</w:t>
-      </w:r>
-    </w:p>
-    <w:p>
-      <w:pPr>
-        <w:pStyle w:val="ListParagraph"/>
-        <w:rPr>
-          <w:lang w:val="en-US"/>
-        </w:rPr>
-      </w:pPr>
-      <w:r>
-        <w:rPr>
-          <w:lang w:val="en-US"/>
-        </w:rPr>
-        <w:t>VIB_ORDERBOOK_SCRIPT  = os.path.join(DATA_DIR, "vib_orderbook.py")</w:t>
-      </w:r>
-    </w:p>
-    <w:p>
-      <w:pPr>
-        <w:pStyle w:val="ListParagraph"/>
-        <w:rPr>
-          <w:lang w:val="en-US"/>
-        </w:rPr>
-      </w:pPr>
-      <w:r>
-        <w:rPr>
-          <w:lang w:val="en-US"/>
-        </w:rPr>
-        <w:t>MASTER_RT_SCRIPT      = os.path.join(REALTIME_DIR, "vib_master.py")</w:t>
-      </w:r>
-    </w:p>
-    <w:p>
-      <w:pPr>
-        <w:pStyle w:val="ListParagraph"/>
-        <w:rPr>
-          <w:lang w:val="en-US"/>
-        </w:rPr>
-      </w:pPr>
-      <w:r>
-        <w:rPr>
-          <w:lang w:val="en-US"/>
-        </w:rPr>
-        <w:t>EXECUTOR_SCRIPT       = os.path.join(REALTIME_DIR, "execute_trades.py")</w:t>
-      </w:r>
-    </w:p>
-    <w:p>
-      <w:pPr>
-        <w:pStyle w:val="ListParagraph"/>
-        <w:rPr>
-          <w:lang w:val="en-US"/>
-        </w:rPr>
-      </w:pPr>
-      <w:r>
-        <w:rPr>
-          <w:lang w:val="en-US"/>
-        </w:rPr>
-        <w:t>RISK_MANAGER_SCRIPT   = os.path.join(REALTIME_DIR, "risk_manager.py")</w:t>
-      </w:r>
-    </w:p>
-    <w:p>
-      <w:pPr>
-        <w:pStyle w:val="ListParagraph"/>
-        <w:rPr>
-          <w:lang w:val="en-US"/>
-        </w:rPr>
-      </w:pPr>
-      <w:r>
-        <w:rPr>
-          <w:lang w:val="en-US"/>
-        </w:rPr>
-        <w:t>TRACKER_SCRIPT        = os.path.join(REALTIME_DIR, "trade_tracker.py")</w:t>
-      </w:r>
-    </w:p>
-    <w:p>
-      <w:pPr>
-        <w:pStyle w:val="ListParagraph"/>
-        <w:rPr>
-          <w:lang w:val="en-US"/>
-        </w:rPr>
-      </w:pPr>
-      <w:r>
-        <w:rPr>
-          <w:lang w:val="en-US"/>
-        </w:rPr>
-        <w:t>MULTI_SOCKET_SCRIPT   = os.path.join(REALTIME_DIR, "multi_socket.py")</w:t>
-      </w:r>
-    </w:p>
-    <w:p>
-      <w:pPr>
-        <w:pStyle w:val="ListParagraph"/>
-        <w:rPr>
-          <w:lang w:val="en-US"/>
-        </w:rPr>
-      </w:pPr>
-    </w:p>
-    <w:p>
-      <w:pPr>
-        <w:pStyle w:val="ListParagraph"/>
-        <w:rPr>
-          <w:lang w:val="en-US"/>
-        </w:rPr>
-      </w:pPr>
-      <w:r>
-        <w:rPr>
-          <w:lang w:val="en-US"/>
-        </w:rPr>
-        <w:t># ────────────────────────────────────────────────────────────────────────────────</w:t>
-      </w:r>
-    </w:p>
-    <w:p>
-      <w:pPr>
-        <w:pStyle w:val="ListParagraph"/>
-        <w:rPr>
-          <w:lang w:val="en-US"/>
-        </w:rPr>
-      </w:pPr>
-      <w:r>
-        <w:rPr>
-          <w:lang w:val="en-US"/>
-        </w:rPr>
-        <w:t># Orchestration &amp; DevOps</w:t>
-      </w:r>
-    </w:p>
-    <w:p>
-      <w:pPr>
-        <w:pStyle w:val="ListParagraph"/>
-        <w:rPr>
-          <w:lang w:val="en-US"/>
-        </w:rPr>
-      </w:pPr>
-      <w:r>
-        <w:rPr>
-          <w:lang w:val="en-US"/>
-        </w:rPr>
-        <w:t># ────────────────────────────────────────────────────────────────────────────────</w:t>
-      </w:r>
-    </w:p>
-    <w:p>
-      <w:pPr>
-        <w:pStyle w:val="ListParagraph"/>
-        <w:rPr>
-          <w:lang w:val="en-US"/>
-        </w:rPr>
-      </w:pPr>
-      <w:r>
-        <w:rPr>
-          <w:lang w:val="en-US"/>
-        </w:rPr>
-        <w:t>MASTER_SCRIPT         = os.path.join(SCRIPTS_DIR, "master.py")</w:t>
-      </w:r>
-    </w:p>
-    <w:p>
-      <w:pPr>
-        <w:pStyle w:val="ListParagraph"/>
-        <w:rPr>
-          <w:lang w:val="en-US"/>
-        </w:rPr>
-      </w:pPr>
-      <w:r>
-        <w:rPr>
-          <w:lang w:val="en-US"/>
-        </w:rPr>
-        <w:t>VERIFY_SCRIPT         = os.path.join(SCRIPTS_DIR, "verify_setup.sh")</w:t>
-      </w:r>
-    </w:p>
-    <w:p>
-      <w:pPr>
-        <w:pStyle w:val="ListParagraph"/>
-        <w:rPr>
-          <w:lang w:val="en-US"/>
-        </w:rPr>
-      </w:pPr>
-      <w:r>
-        <w:rPr>
-          <w:lang w:val="en-US"/>
-        </w:rPr>
-        <w:t>ROLLBACK_SCRIPT       = os.path.join(SCRIPTS_DIR, "rollback_models.sh")</w:t>
-      </w:r>
-    </w:p>
-    <w:p>
-      <w:pPr>
-        <w:pStyle w:val="ListParagraph"/>
-        <w:rPr>
-          <w:lang w:val="en-US"/>
-        </w:rPr>
-      </w:pPr>
-    </w:p>
-    <w:p>
-      <w:pPr>
-        <w:pStyle w:val="ListParagraph"/>
-        <w:rPr>
-          <w:lang w:val="en-US"/>
-        </w:rPr>
-      </w:pPr>
-      <w:r>
-        <w:rPr>
-          <w:lang w:val="en-US"/>
-        </w:rPr>
-        <w:t># ────────────────────────────────────────────────────────────────────────────────</w:t>
-      </w:r>
-    </w:p>
-    <w:p>
-      <w:pPr>
-        <w:pStyle w:val="ListParagraph"/>
-        <w:rPr>
-          <w:lang w:val="en-US"/>
-        </w:rPr>
-      </w:pPr>
-      <w:r>
-        <w:rPr>
-          <w:lang w:val="en-US"/>
-        </w:rPr>
-        <w:t># Monitoring &amp; Backtest</w:t>
-      </w:r>
-    </w:p>
-    <w:p>
-      <w:pPr>
-        <w:pStyle w:val="ListParagraph"/>
-        <w:rPr>
-          <w:lang w:val="en-US"/>
-        </w:rPr>
-      </w:pPr>
-      <w:r>
-        <w:rPr>
-          <w:lang w:val="en-US"/>
-        </w:rPr>
-        <w:t># ────────────────────────────────────────────────────────────────────────────────</w:t>
-      </w:r>
-    </w:p>
-    <w:p>
-      <w:pPr>
-        <w:pStyle w:val="ListParagraph"/>
-        <w:rPr>
-          <w:lang w:val="en-US"/>
-        </w:rPr>
-      </w:pPr>
-      <w:r>
-        <w:rPr>
-          <w:lang w:val="en-US"/>
-        </w:rPr>
-        <w:t>BACKTEST_MODEL        = os.path.join(BACKTEST_DIR, "backtest_model.py")</w:t>
-      </w:r>
-    </w:p>
-    <w:p>
-      <w:pPr>
-        <w:pStyle w:val="ListParagraph"/>
-        <w:rPr>
-          <w:lang w:val="en-US"/>
-        </w:rPr>
-      </w:pPr>
-      <w:r>
-        <w:rPr>
-          <w:lang w:val="en-US"/>
-        </w:rPr>
-        <w:t>BACKTEST_UTILS        = os.path.join(BACKTEST_DIR, "backtest_utils.py")</w:t>
-      </w:r>
-    </w:p>
-    <w:p>
-      <w:pPr>
-        <w:pStyle w:val="ListParagraph"/>
-        <w:rPr>
-          <w:lang w:val="en-US"/>
-        </w:rPr>
-      </w:pPr>
-      <w:r>
-        <w:rPr>
-          <w:lang w:val="en-US"/>
-        </w:rPr>
-        <w:t>METRICS_COLLECTOR     = os.path.join(MONITORING_DIR, "metrics_collector.py")</w:t>
-      </w:r>
-    </w:p>
-    <w:p>
-      <w:pPr>
-        <w:pStyle w:val="ListParagraph"/>
-        <w:rPr>
-          <w:lang w:val="en-US"/>
-        </w:rPr>
-      </w:pPr>
-      <w:r>
-        <w:rPr>
-          <w:lang w:val="en-US"/>
-        </w:rPr>
-        <w:t>DASHBOARD_APP         = os.path.join(MONITORING_DIR, "dashboard.py")</w:t>
-      </w:r>
-    </w:p>
-    <w:p>
-      <w:pPr>
-        <w:pStyle w:val="ListParagraph"/>
-        <w:rPr>
-          <w:lang w:val="en-US"/>
-        </w:rPr>
-      </w:pPr>
-    </w:p>
-    <w:p>
-      <w:pPr>
-        <w:pStyle w:val="ListParagraph"/>
-        <w:rPr>
-          <w:lang w:val="en-US"/>
-        </w:rPr>
-      </w:pPr>
-      <w:r>
-        <w:rPr>
-          <w:lang w:val="en-US"/>
-        </w:rPr>
-        <w:t># ────────────────────────────────────────────────────────────────────────────────</w:t>
-      </w:r>
-    </w:p>
-    <w:p>
-      <w:pPr>
-        <w:pStyle w:val="ListParagraph"/>
-        <w:rPr>
-          <w:lang w:val="en-US"/>
-        </w:rPr>
-      </w:pPr>
-      <w:r>
-        <w:rPr>
-          <w:lang w:val="en-US"/>
-        </w:rPr>
-        <w:t># Testing</w:t>
-      </w:r>
-    </w:p>
-    <w:p>
-      <w:pPr>
-        <w:pStyle w:val="ListParagraph"/>
-        <w:rPr>
-          <w:lang w:val="en-US"/>
-        </w:rPr>
-      </w:pPr>
-      <w:r>
-        <w:rPr>
-          <w:lang w:val="en-US"/>
-        </w:rPr>
-        <w:t># ────────────────────────────────────────────────────────────────────────────────</w:t>
-      </w:r>
-    </w:p>
-    <w:p>
-      <w:pPr>
-        <w:pStyle w:val="ListParagraph"/>
-        <w:rPr>
-          <w:lang w:val="en-US"/>
-        </w:rPr>
-      </w:pPr>
-      <w:r>
-        <w:rPr>
-          <w:lang w:val="en-US"/>
-        </w:rPr>
-        <w:t>TEST_GENERATE         = os.path.join(TESTS_DIR, "test_generate_training_data.py")</w:t>
-      </w:r>
-    </w:p>
-    <w:p>
-      <w:pPr>
-        <w:pStyle w:val="ListParagraph"/>
-        <w:rPr>
-          <w:lang w:val="en-US"/>
-        </w:rPr>
-      </w:pPr>
-      <w:r>
-        <w:rPr>
-          <w:lang w:val="en-US"/>
-        </w:rPr>
-        <w:t>TEST_MERGE            = os.path.join(TESTS_DIR, "test_merge_data.py")</w:t>
-      </w:r>
-    </w:p>
-    <w:p>
-      <w:pPr>
-        <w:pStyle w:val="ListParagraph"/>
-        <w:rPr>
-          <w:lang w:val="en-US"/>
-        </w:rPr>
-      </w:pPr>
-      <w:r>
-        <w:rPr>
-          <w:lang w:val="en-US"/>
-        </w:rPr>
-        <w:t>TEST_MODELS           = os.path.join(TESTS_DIR, "test_models.py")</w:t>
-      </w:r>
-    </w:p>
-    <w:p>
-      <w:pPr>
-        <w:pStyle w:val="ListParagraph"/>
-        <w:rPr>
-          <w:lang w:val="en-US"/>
-        </w:rPr>
-      </w:pPr>
-      <w:r>
-        <w:rPr>
-          <w:lang w:val="en-US"/>
-        </w:rPr>
-        <w:t>TEST_REALTIME         = os.path.join(TESTS_DIR, "test_realtime.py")</w:t>
-      </w:r>
-    </w:p>
-    <w:p>
-      <w:pPr>
-        <w:pStyle w:val="ListParagraph"/>
-        <w:rPr>
-          <w:lang w:val="en-US"/>
-        </w:rPr>
-      </w:pPr>
-    </w:p>
-    <w:p>
-      <w:pPr>
-        <w:pStyle w:val="ListParagraph"/>
-        <w:rPr>
-          <w:lang w:val="en-US"/>
-        </w:rPr>
-      </w:pPr>
-      <w:r>
-        <w:rPr>
-          <w:lang w:val="en-US"/>
-        </w:rPr>
-        <w:t># ────────────────────────────────────────────────────────────────────────────────</w:t>
-      </w:r>
-    </w:p>
-    <w:p>
-      <w:pPr>
-        <w:pStyle w:val="ListParagraph"/>
-        <w:rPr>
-          <w:lang w:val="en-US"/>
-        </w:rPr>
-      </w:pPr>
-      <w:r>
-        <w:rPr>
-          <w:lang w:val="en-US"/>
-        </w:rPr>
-        <w:t># Telegram / Notification</w:t>
-      </w:r>
-    </w:p>
-    <w:p>
-      <w:pPr>
-        <w:pStyle w:val="ListParagraph"/>
-        <w:rPr>
-          <w:lang w:val="en-US"/>
-        </w:rPr>
-      </w:pPr>
-      <w:r>
-        <w:rPr>
-          <w:lang w:val="en-US"/>
-        </w:rPr>
-        <w:t># ────────────────────────────────────────────────────────────────────────────────</w:t>
-      </w:r>
-    </w:p>
-    <w:p>
-      <w:pPr>
-        <w:pStyle w:val="ListParagraph"/>
-        <w:rPr>
-          <w:lang w:val="en-US"/>
-        </w:rPr>
-      </w:pPr>
-      <w:r>
-        <w:rPr>
-          <w:lang w:val="en-US"/>
-        </w:rPr>
-        <w:t>TELEGRAM_TOKEN        = os.getenv("VIB_BOT_TELEGRAM_TOKEN", "")</w:t>
-      </w:r>
-    </w:p>
-    <w:p>
-      <w:pPr>
-        <w:pStyle w:val="ListParagraph"/>
-        <w:rPr>
-          <w:lang w:val="en-US"/>
-        </w:rPr>
-      </w:pPr>
-      <w:r>
-        <w:rPr>
-          <w:lang w:val="en-US"/>
-        </w:rPr>
-        <w:t>CHAT_ID               = int(os.getenv("VIB_BOT_CHAT_ID", "123456789"))</w:t>
-      </w:r>
-    </w:p>
-    <w:p>
-      <w:pPr>
-        <w:pStyle w:val="ListParagraph"/>
-        <w:rPr>
-          <w:lang w:val="en-US"/>
-        </w:rPr>
-      </w:pPr>
-    </w:p>
-    <w:p>
-      <w:pPr>
-        <w:pStyle w:val="ListParagraph"/>
-        <w:rPr>
-          <w:lang w:val="en-US"/>
-        </w:rPr>
-      </w:pPr>
-      <w:r>
-        <w:rPr>
-          <w:lang w:val="en-US"/>
-        </w:rPr>
-        <w:t># ────────────────────────────────────────────────────────────────────────────────</w:t>
-      </w:r>
-    </w:p>
-    <w:p>
-      <w:pPr>
-        <w:pStyle w:val="ListParagraph"/>
-        <w:rPr>
-          <w:lang w:val="en-US"/>
-        </w:rPr>
-      </w:pPr>
-      <w:r>
-        <w:rPr>
-          <w:lang w:val="en-US"/>
-        </w:rPr>
-        <w:t># Parameters: thresholds, windows &amp; risk sizing</w:t>
-      </w:r>
-    </w:p>
-    <w:p>
-      <w:pPr>
-        <w:pStyle w:val="ListParagraph"/>
-        <w:rPr>
-          <w:lang w:val="en-US"/>
-        </w:rPr>
-      </w:pPr>
-      <w:r>
-        <w:rPr>
-          <w:lang w:val="en-US"/>
-        </w:rPr>
-        <w:t># ────────────────────────────────────────────────────────────────────────────────</w:t>
-      </w:r>
-    </w:p>
-    <w:p>
-      <w:pPr>
-        <w:pStyle w:val="ListParagraph"/>
-        <w:rPr>
-          <w:lang w:val="en-US"/>
-        </w:rPr>
-      </w:pPr>
-      <w:r>
-        <w:rPr>
-          <w:lang w:val="en-US"/>
-        </w:rPr>
-        <w:t>BIG_TRADE_THRESHOLD       = int(os.getenv("VIB_BOT_BIG_TRADE_THRESHOLD", "100000"))</w:t>
-      </w:r>
-    </w:p>
-    <w:p>
-      <w:pPr>
-        <w:pStyle w:val="ListParagraph"/>
-        <w:rPr>
-          <w:lang w:val="en-US"/>
-        </w:rPr>
-      </w:pPr>
-      <w:r>
-        <w:rPr>
-          <w:lang w:val="en-US"/>
-        </w:rPr>
-        <w:t>DATA_FRESHNESS_THRESHOLD  = int(os.getenv("VIB_BOT_DATA_FRESHNESS_THRESHOLD", "120"))</w:t>
-      </w:r>
-    </w:p>
-    <w:p>
-      <w:pPr>
-        <w:pStyle w:val="ListParagraph"/>
-        <w:rPr>
-          <w:lang w:val="en-US"/>
-        </w:rPr>
-      </w:pPr>
-      <w:r>
-        <w:rPr>
-          <w:lang w:val="en-US"/>
-        </w:rPr>
-        <w:t>FEEDBACK_WINDOW           = int(os.getenv("VIB_BOT_FEEDBACK_WINDOW", "3600"))</w:t>
-      </w:r>
-    </w:p>
-    <w:p>
-      <w:pPr>
-        <w:pStyle w:val="ListParagraph"/>
-        <w:rPr>
-          <w:lang w:val="en-US"/>
-        </w:rPr>
-      </w:pPr>
-      <w:r>
-        <w:rPr>
-          <w:lang w:val="en-US"/>
-        </w:rPr>
-        <w:t>LOOK_AHEAD                = int(os.getenv("VIB_BOT_LOOK_AHEAD", "5"))</w:t>
-      </w:r>
-    </w:p>
-    <w:p>
-      <w:pPr>
-        <w:pStyle w:val="ListParagraph"/>
-        <w:rPr>
-          <w:lang w:val="en-US"/>
-        </w:rPr>
-      </w:pPr>
-      <w:r>
-        <w:rPr>
-          <w:lang w:val="en-US"/>
-        </w:rPr>
-        <w:t>INFERENCE_INTERVAL        = int(os.getenv("VIB_BOT_INFERENCE_INTERVAL", "30"))</w:t>
-      </w:r>
-    </w:p>
-    <w:p>
-      <w:pPr>
-        <w:pStyle w:val="ListParagraph"/>
-        <w:rPr>
-          <w:lang w:val="en-US"/>
-        </w:rPr>
-      </w:pPr>
-    </w:p>
-    <w:p>
-      <w:pPr>
-        <w:pStyle w:val="ListParagraph"/>
-        <w:rPr>
-          <w:lang w:val="en-US"/>
-        </w:rPr>
-      </w:pPr>
-      <w:r>
-        <w:rPr>
-          <w:lang w:val="en-US"/>
-        </w:rPr>
-        <w:t># Backtest realism</w:t>
-      </w:r>
-    </w:p>
-    <w:p>
-      <w:pPr>
-        <w:pStyle w:val="ListParagraph"/>
-        <w:rPr>
-          <w:lang w:val="en-US"/>
-        </w:rPr>
-      </w:pPr>
-      <w:r>
-        <w:rPr>
-          <w:lang w:val="en-US"/>
-        </w:rPr>
-        <w:t>BACKTEST_SLIPPAGE_PCT     = float(os.getenv("VIB_BOT_BACKTEST_SLIPPAGE_PCT", "0.0005"))</w:t>
-      </w:r>
-    </w:p>
-    <w:p>
-      <w:pPr>
-        <w:pStyle w:val="ListParagraph"/>
-        <w:rPr>
-          <w:lang w:val="en-US"/>
-        </w:rPr>
-      </w:pPr>
-      <w:r>
-        <w:rPr>
-          <w:lang w:val="en-US"/>
-        </w:rPr>
-        <w:t>BACKTEST_FEES_PCT         = float(os.getenv("VIB_BOT_BACKTEST_FEES_PCT",     "0.001"))</w:t>
-      </w:r>
-    </w:p>
-    <w:p>
-      <w:pPr>
-        <w:pStyle w:val="ListParagraph"/>
-        <w:rPr>
-          <w:lang w:val="en-US"/>
-        </w:rPr>
-      </w:pPr>
-    </w:p>
-    <w:p>
-      <w:pPr>
-        <w:pStyle w:val="ListParagraph"/>
-        <w:rPr>
-          <w:lang w:val="en-US"/>
-        </w:rPr>
-      </w:pPr>
-      <w:r>
-        <w:rPr>
-          <w:lang w:val="en-US"/>
-        </w:rPr>
-        <w:t># Execution</w:t>
-      </w:r>
-      <w:r>
-        <w:rPr>
-          <w:rFonts w:ascii="Cambria Math" w:hAnsi="Cambria Math" w:cs="Cambria Math"/>
-          <w:lang w:val="en-US"/>
-        </w:rPr>
-        <w:t>‐</w:t>
-      </w:r>
-      <w:r>
-        <w:rPr>
-          <w:lang w:val="en-US"/>
-        </w:rPr>
-        <w:t>Engine / Risk &amp; Sizing</w:t>
-      </w:r>
-    </w:p>
-    <w:p>
-      <w:pPr>
-        <w:pStyle w:val="ListParagraph"/>
-        <w:rPr>
-          <w:lang w:val="en-US"/>
-        </w:rPr>
-      </w:pPr>
-      <w:r>
-        <w:rPr>
-          <w:lang w:val="en-US"/>
-        </w:rPr>
-        <w:t>RISK_PER_TRADE            = float(os.getenv("VIB_BOT_RISK_PER_TRADE",     "0.005"))</w:t>
-      </w:r>
-    </w:p>
-    <w:p>
-      <w:pPr>
-        <w:pStyle w:val="ListParagraph"/>
-        <w:rPr>
-          <w:lang w:val="en-US"/>
-        </w:rPr>
-      </w:pPr>
-      <w:r>
-        <w:rPr>
-          <w:lang w:val="en-US"/>
-        </w:rPr>
-        <w:t>STOP_LOSS_PCT             = float(os.getenv("VIB_BOT_STOP_LOSS_PCT",      "0.012"))</w:t>
-      </w:r>
-    </w:p>
-    <w:p>
-      <w:pPr>
-        <w:pStyle w:val="ListParagraph"/>
-        <w:rPr>
-          <w:lang w:val="en-US"/>
-        </w:rPr>
-      </w:pPr>
-      <w:r>
-        <w:rPr>
-          <w:lang w:val="en-US"/>
-        </w:rPr>
-        <w:t>TAKE_PROFIT_PCT           = float(os.getenv("VIB_BOT_TAKE_PROFIT_PCT",    "0.018"))</w:t>
-      </w:r>
-    </w:p>
-    <w:p>
-      <w:pPr>
-        <w:pStyle w:val="ListParagraph"/>
-        <w:rPr>
-          <w:lang w:val="en-US"/>
-        </w:rPr>
-      </w:pPr>
-      <w:r>
-        <w:rPr>
-          <w:lang w:val="en-US"/>
-        </w:rPr>
-        <w:t># live trading slippage guard</w:t>
-      </w:r>
-    </w:p>
-    <w:p>
-      <w:pPr>
-        <w:pStyle w:val="ListParagraph"/>
-        <w:rPr>
-          <w:lang w:val="en-US"/>
-        </w:rPr>
-      </w:pPr>
-      <w:r>
-        <w:rPr>
-          <w:lang w:val="en-US"/>
-        </w:rPr>
-        <w:t>SLIPPAGE_TOLERANCE        = float(os.getenv("VIB_BOT_SLIPPAGE_TOLERANCE", "0.001"))</w:t>
-      </w:r>
-    </w:p>
-    <w:p>
-      <w:pPr>
-        <w:pStyle w:val="ListParagraph"/>
-        <w:rPr>
-          <w:lang w:val="en-US"/>
-        </w:rPr>
-      </w:pPr>
-      <w:r>
-        <w:rPr>
-          <w:lang w:val="en-US"/>
-        </w:rPr>
-        <w:t># portfolio drawdown breaker</w:t>
-      </w:r>
-    </w:p>
-    <w:p>
-      <w:pPr>
-        <w:pStyle w:val="ListParagraph"/>
-        <w:rPr>
-          <w:lang w:val="en-US"/>
-        </w:rPr>
-      </w:pPr>
-      <w:r>
-        <w:rPr>
-          <w:lang w:val="en-US"/>
-        </w:rPr>
-        <w:t>MAX_PORTFOLIO_DRAWDOWN    = float(os.getenv("VIB_BOT_MAX_DRAWDOWN",      "0.20"))</w:t>
-      </w:r>
-    </w:p>
-    <w:p>
-      <w:pPr>
-        <w:pStyle w:val="ListParagraph"/>
-        <w:rPr>
-          <w:lang w:val="en-US"/>
-        </w:rPr>
-      </w:pPr>
-    </w:p>
-    <w:p>
-      <w:pPr>
-        <w:pStyle w:val="ListParagraph"/>
-        <w:rPr>
-          <w:lang w:val="en-US"/>
-        </w:rPr>
-      </w:pPr>
-      <w:r>
-        <w:rPr>
-          <w:lang w:val="en-US"/>
-        </w:rPr>
-        <w:t>COOLDOWN_HOURS            = int(os.getenv("VIB_BOT_COOLDOWN_HOURS",      "2"))</w:t>
-      </w:r>
-    </w:p>
-    <w:p>
-      <w:pPr>
-        <w:pStyle w:val="ListParagraph"/>
-        <w:rPr>
-          <w:lang w:val="en-US"/>
-        </w:rPr>
-      </w:pPr>
-      <w:r>
-        <w:rPr>
-          <w:lang w:val="en-US"/>
-        </w:rPr>
-        <w:t>MAX_DAILY_DRAWDOWN        = float(os.getenv("VIB_BOT_MAX_DAILY_DRAWDOWN","0.05"))</w:t>
-      </w:r>
-    </w:p>
-    <w:p>
-      <w:pPr>
-        <w:pStyle w:val="ListParagraph"/>
-        <w:rPr>
-          <w:lang w:val="en-US"/>
-        </w:rPr>
-      </w:pPr>
-    </w:p>
-    <w:p>
-      <w:pPr>
-        <w:pStyle w:val="ListParagraph"/>
-        <w:rPr>
-          <w:lang w:val="en-US"/>
-        </w:rPr>
-      </w:pPr>
-      <w:r>
-        <w:rPr>
-          <w:lang w:val="en-US"/>
-        </w:rPr>
-        <w:t># ────────────────────────────────────────────────────────────────────────────────</w:t>
-      </w:r>
-    </w:p>
-    <w:p>
-      <w:pPr>
-        <w:pStyle w:val="ListParagraph"/>
-        <w:rPr>
-          <w:lang w:val="en-US"/>
-        </w:rPr>
-      </w:pPr>
-      <w:r>
-        <w:rPr>
-          <w:lang w:val="en-US"/>
-        </w:rPr>
-        <w:t># Trading universe</w:t>
-      </w:r>
-    </w:p>
-    <w:p>
-      <w:pPr>
-        <w:pStyle w:val="ListParagraph"/>
-        <w:rPr>
-          <w:lang w:val="en-US"/>
-        </w:rPr>
-      </w:pPr>
-      <w:r>
-        <w:rPr>
-          <w:lang w:val="en-US"/>
-        </w:rPr>
-        <w:t># ────────────────────────────────────────────────────────────────────────────────</w:t>
-      </w:r>
-    </w:p>
-    <w:p>
-      <w:pPr>
-        <w:pStyle w:val="ListParagraph"/>
-        <w:rPr>
-          <w:lang w:val="en-US"/>
-        </w:rPr>
-      </w:pPr>
-      <w:r>
-        <w:rPr>
-          <w:lang w:val="en-US"/>
-        </w:rPr>
-        <w:t>_env_syms = os.getenv("VIB_BOT_SYMBOLS")</w:t>
-      </w:r>
-    </w:p>
-    <w:p>
-      <w:pPr>
-        <w:pStyle w:val="ListParagraph"/>
-        <w:rPr>
-          <w:lang w:val="en-US"/>
-        </w:rPr>
-      </w:pPr>
-      <w:r>
-        <w:rPr>
-          <w:lang w:val="en-US"/>
-        </w:rPr>
-        <w:t>if _env_syms:</w:t>
-      </w:r>
-    </w:p>
-    <w:p>
-      <w:pPr>
-        <w:pStyle w:val="ListParagraph"/>
-        <w:rPr>
-          <w:lang w:val="en-US"/>
-        </w:rPr>
-      </w:pPr>
-      <w:r>
-        <w:rPr>
-          <w:lang w:val="en-US"/>
-        </w:rPr>
-        <w:t xml:space="preserve">    SYMBOLS = _env_syms.split(",")</w:t>
-      </w:r>
-    </w:p>
-    <w:p>
-      <w:pPr>
-        <w:pStyle w:val="ListParagraph"/>
-        <w:rPr>
-          <w:lang w:val="en-US"/>
-        </w:rPr>
-      </w:pPr>
-      <w:r>
-        <w:rPr>
-          <w:lang w:val="en-US"/>
-        </w:rPr>
-        <w:t>else:</w:t>
-      </w:r>
-    </w:p>
-    <w:p>
-      <w:pPr>
-        <w:pStyle w:val="ListParagraph"/>
-        <w:rPr>
-          <w:lang w:val="en-US"/>
-        </w:rPr>
-      </w:pPr>
-      <w:r>
-        <w:rPr>
-          <w:lang w:val="en-US"/>
-        </w:rPr>
-        <w:t xml:space="preserve">    symbols_file = os.path.join(BASE_DIR, "symbols.json")</w:t>
-      </w:r>
-    </w:p>
-    <w:p>
-      <w:pPr>
-        <w:pStyle w:val="ListParagraph"/>
-        <w:rPr>
-          <w:lang w:val="en-US"/>
-        </w:rPr>
-      </w:pPr>
-      <w:r>
-        <w:rPr>
-          <w:lang w:val="en-US"/>
-        </w:rPr>
-        <w:t xml:space="preserve">    try:</w:t>
-      </w:r>
-    </w:p>
-    <w:p>
-      <w:pPr>
-        <w:pStyle w:val="ListParagraph"/>
-        <w:rPr>
-          <w:lang w:val="en-US"/>
-        </w:rPr>
-      </w:pPr>
-      <w:r>
-        <w:rPr>
-          <w:lang w:val="en-US"/>
-        </w:rPr>
-        <w:t xml:space="preserve">        with open(symbols_file) as f:</w:t>
-      </w:r>
-    </w:p>
-    <w:p>
-      <w:pPr>
-        <w:pStyle w:val="ListParagraph"/>
-        <w:rPr>
-          <w:lang w:val="en-US"/>
-        </w:rPr>
-      </w:pPr>
-      <w:r>
-        <w:rPr>
-          <w:lang w:val="en-US"/>
-        </w:rPr>
-        <w:t xml:space="preserve">            SYMBOLS = json.load(f)</w:t>
-      </w:r>
-    </w:p>
-    <w:p>
-      <w:pPr>
-        <w:pStyle w:val="ListParagraph"/>
-        <w:rPr>
-          <w:lang w:val="en-US"/>
-        </w:rPr>
-      </w:pPr>
-      <w:r>
-        <w:rPr>
-          <w:lang w:val="en-US"/>
-        </w:rPr>
-        <w:t xml:space="preserve">    except Exception:</w:t>
-      </w:r>
-    </w:p>
-    <w:p>
-      <w:pPr>
-        <w:pStyle w:val="ListParagraph"/>
-        <w:rPr>
-          <w:lang w:val="en-US"/>
-        </w:rPr>
-      </w:pPr>
-      <w:r>
-        <w:rPr>
-          <w:lang w:val="en-US"/>
-        </w:rPr>
-        <w:t xml:space="preserve">        # fallback to a minimal list if symbols.json missing</w:t>
-      </w:r>
-    </w:p>
-    <w:p>
-      <w:pPr>
-        <w:pStyle w:val="ListParagraph"/>
-        <w:rPr>
-          <w:lang w:val="en-US"/>
-        </w:rPr>
-      </w:pPr>
-      <w:r>
-        <w:rPr>
-          <w:lang w:val="en-US"/>
-        </w:rPr>
-        <w:t xml:space="preserve">        SYMBOLS = ["VIBUSDT", "BTCUSDT", "ETHUSDT", "BNBUSDT"]</w:t>
-      </w:r>
-    </w:p>
-    <w:p>
-      <w:pPr>
-        <w:pStyle w:val="ListParagraph"/>
-        <w:rPr>
-          <w:lang w:val="en-US"/>
-        </w:rPr>
-      </w:pPr>
-    </w:p>
-    <w:p>
-      <w:pPr>
-        <w:pStyle w:val="ListParagraph"/>
-        <w:rPr>
-          <w:lang w:val="en-US"/>
-        </w:rPr>
-      </w:pPr>
-      <w:r>
-        <w:rPr>
-          <w:lang w:val="en-US"/>
-        </w:rPr>
-        <w:t># Correlation symbols for feature</w:t>
-      </w:r>
-      <w:r>
-        <w:rPr>
-          <w:rFonts w:ascii="Cambria Math" w:hAnsi="Cambria Math" w:cs="Cambria Math"/>
-          <w:lang w:val="en-US"/>
-        </w:rPr>
-        <w:t>‐</w:t>
-      </w:r>
-      <w:r>
-        <w:rPr>
-          <w:lang w:val="en-US"/>
-        </w:rPr>
-        <w:t>window diffs</w:t>
-      </w:r>
-    </w:p>
-    <w:p>
-      <w:pPr>
-        <w:pStyle w:val="ListParagraph"/>
-        <w:rPr>
-          <w:lang w:val="en-US"/>
-        </w:rPr>
-      </w:pPr>
-      <w:r>
-        <w:rPr>
-          <w:lang w:val="en-US"/>
-        </w:rPr>
-        <w:t>CORRELATION_SYMBOLS = SYMBOLS</w:t>
-      </w:r>
-    </w:p>
-    <w:p>
-      <w:pPr>
-        <w:pStyle w:val="ListParagraph"/>
-        <w:rPr>
-          <w:lang w:val="en-US"/>
-        </w:rPr>
-      </w:pPr>
-    </w:p>
-    <w:p>
-      <w:pPr>
-        <w:pStyle w:val="ListParagraph"/>
-        <w:rPr>
-          <w:lang w:val="en-US"/>
-        </w:rPr>
-      </w:pPr>
-      <w:r>
-        <w:rPr>
-          <w:lang w:val="en-US"/>
-        </w:rPr>
-        <w:t># ────────────────────────────────────────────────────────────────────────────────</w:t>
-      </w:r>
-    </w:p>
-    <w:p>
-      <w:pPr>
-        <w:pStyle w:val="ListParagraph"/>
-        <w:rPr>
-          <w:lang w:val="en-US"/>
-        </w:rPr>
-      </w:pPr>
-      <w:r>
-        <w:rPr>
-          <w:lang w:val="en-US"/>
-        </w:rPr>
-        <w:t># Exchange / API credentials</w:t>
-      </w:r>
-    </w:p>
-    <w:p>
-      <w:pPr>
-        <w:pStyle w:val="ListParagraph"/>
-        <w:rPr>
-          <w:lang w:val="en-US"/>
-        </w:rPr>
-      </w:pPr>
-      <w:r>
-        <w:rPr>
-          <w:lang w:val="en-US"/>
-        </w:rPr>
-        <w:t># ────────────────────────────────────────────────────────────────────────────────</w:t>
-      </w:r>
-    </w:p>
-    <w:p>
-      <w:pPr>
-        <w:pStyle w:val="ListParagraph"/>
-        <w:rPr>
-          <w:lang w:val="en-US"/>
-        </w:rPr>
-      </w:pPr>
-      <w:r>
-        <w:rPr>
-          <w:lang w:val="en-US"/>
-        </w:rPr>
-        <w:t>EXCHANGE_API_KEY          = os.getenv("EXCHANGE_API_KEY", "")</w:t>
-      </w:r>
-    </w:p>
-    <w:p>
-      <w:pPr>
-        <w:pStyle w:val="ListParagraph"/>
-        <w:rPr>
-          <w:lang w:val="en-US"/>
-        </w:rPr>
-      </w:pPr>
-      <w:r>
-        <w:rPr>
-          <w:lang w:val="en-US"/>
-        </w:rPr>
-        <w:t>EXCHANGE_API_SECRET       = os.getenv("EXCHANGE_API_SECRET", "")</w:t>
-      </w:r>
-    </w:p>
-    <w:p>
-      <w:pPr>
-        <w:pStyle w:val="ListParagraph"/>
-        <w:rPr>
-          <w:lang w:val="en-US"/>
-        </w:rPr>
-      </w:pPr>
-    </w:p>
-    <w:p>
-      <w:pPr>
-        <w:pStyle w:val="ListParagraph"/>
-        <w:rPr>
-          <w:lang w:val="en-US"/>
-        </w:rPr>
-      </w:pPr>
-      <w:r>
-        <w:rPr>
-          <w:lang w:val="en-US"/>
-        </w:rPr>
-        <w:t># ────────────────────────────────────────────────────────────────────────────────</w:t>
-      </w:r>
-    </w:p>
-    <w:p>
-      <w:pPr>
-        <w:pStyle w:val="ListParagraph"/>
-        <w:rPr>
-          <w:lang w:val="en-US"/>
-        </w:rPr>
-      </w:pPr>
-      <w:r>
-        <w:rPr>
-          <w:lang w:val="en-US"/>
-        </w:rPr>
-        <w:t># Monitoring</w:t>
-      </w:r>
-    </w:p>
-    <w:p>
-      <w:pPr>
-        <w:pStyle w:val="ListParagraph"/>
-        <w:rPr>
-          <w:lang w:val="en-US"/>
-        </w:rPr>
-      </w:pPr>
-      <w:r>
-        <w:rPr>
-          <w:lang w:val="en-US"/>
-        </w:rPr>
-        <w:t># ────────────────────────────────────────────────────────────────────────────────</w:t>
-      </w:r>
-    </w:p>
-    <w:p>
-      <w:pPr>
-        <w:pStyle w:val="ListParagraph"/>
-        <w:rPr>
-          <w:lang w:val="en-US"/>
-        </w:rPr>
-      </w:pPr>
-      <w:r>
-        <w:rPr>
-          <w:lang w:val="en-US"/>
-        </w:rPr>
-        <w:t>MONITORING_INTERVAL       = int(os.getenv("VIB_BOT_MONITORING_INTERVAL", "60"))</w:t>
-      </w:r>
+        <w:t>MONITORING_INTERVAL   = int(os.getenv("VIB_BOT_MONITORING_INTERVAL", "60"))</w:t>
+      </w:r>
+    </w:p>
+    <w:p>
+      <w:pPr>
+        <w:pStyle w:val="ListParagraph"/>
+        <w:rPr>
+          <w:lang w:val="en-US"/>
+        </w:rPr>
+      </w:pPr>
     </w:p>
     <w:p>
       <w:pPr>

</xml_diff>